<commit_message>
feat: offer validity period auto-selects quarterly PGL + v1.8 report update
Adds "Wazna od"/"Wazna do" fields next to the Arkusz/Krag toggle in the
calculator. The quarter derived from "Wazna od" automatically pulls the
scheduled PGL price for that quarter (lib/pglQuarterly.ts, generalized to
accept an explicit year/quarter instead of always "now"), the same way
switching steel type already resets PGL. A range spanning more than one
quarter shows a warning instead of silently guessing. The chosen range
also renders on the PDF footer, alongside the existing static 48h notice.

Auto-apply is wired only through the date inputs' onChange, never through
restoreOfferData, so opening an existing offer never overwrites its frozen
PGL with a live value.

Co-Authored-By: Claude Sonnet 5 <noreply@anthropic.com>
Claude-Session: https://claude.ai/code/session_01JZQ51NAojNSFPyNg7omtxc
</commit_message>
<xml_diff>
--- a/Historia wersji oraz md/Historia wersji/AMSteel_Quote_Raport_Wersji_1.8.docx
+++ b/Historia wersji oraz md/Historia wersji/AMSteel_Quote_Raport_Wersji_1.8.docx
@@ -115,7 +115,7 @@
           </w:tcPr>
           <w:p>
             <w:r>
-              <w:t>11.09.2026 - 11.09.2026</w:t>
+              <w:t>11.09.2026 - 14.09.2026</w:t>
             </w:r>
           </w:p>
         </w:tc>
@@ -141,7 +141,7 @@
           </w:tcPr>
           <w:p>
             <w:r>
-              <w:t>11.09.2026</w:t>
+              <w:t>14.09.2026</w:t>
             </w:r>
           </w:p>
         </w:tc>
@@ -262,7 +262,7 @@
           </w:tcPr>
           <w:p>
             <w:r>
-              <w:t>11.09.2026</w:t>
+              <w:t>11.09.2026, 14.09.2026</w:t>
             </w:r>
           </w:p>
         </w:tc>
@@ -272,7 +272,7 @@
           </w:tcPr>
           <w:p>
             <w:r>
-              <w:t>11.09.2026</w:t>
+              <w:t>14.09.2026</w:t>
             </w:r>
           </w:p>
         </w:tc>
@@ -282,7 +282,7 @@
           </w:tcPr>
           <w:p>
             <w:r>
-              <w:t>Dodano opcjonalny komentarz do pozycji z niezerową dopłatą dodatkową w kalkulatorze. Pole komentarza oraz osobny checkbox „Dołącz komentarz do PDF” pojawiają się dopiero po wpisaniu wartości różnej od zera, a treść zapisuje się razem z resztą konfiguracji pozycji (odtwarzana przy edycji, nieusuwana przy chwilowym wyzerowaniu dopłaty). Po zaznaczeniu checkboxa komentarz trafia jako dodatkowy wpis do kolumny „Uwagi” w PDF oferty, we wszystkich miejscach eksportu (kalkulator, Moje oferty, Panel seniora, Panel administratora). Dodano również gatunek jednorazowy — możliwość wyceny gatunku spoza cennika (nazwa + dopłata EUR/t) w obrębie jednej oferty, bez dopisywania go do cennika i bez wpływu na pozostałe oferty. Dodano też opcję odbioru własnego w transporcie — checkbox w panelu „Trasa i transport” ustawia transport na 0 €/t, gdy klient sam odbiera towar spod zakładu. Dodano też harmonogram kwartalny PGL bazowego: administrator planuje ceny na Q1–Q4 wybranego roku osobno dla każdego typu stali, a kalkulator przełącza się na cenę danego kwartału automatycznie z chwilą jego rozpoczęcia. Tabela w panelu administratora pokazuje obok siebie cenę bieżącego miesiąca i wszystkie cztery kwartały. Funkcja wymaga migracji bazy danych (021_create_pgl_quarterly_prices.sql). Poprawiono też zapis ustawień, który przy aktywnej cenie kwartalnej nadpisywał nią ręczną cenę bazową PGL, oraz zaktualizowano dokumentację repozytorium (README, opis „About” na GitHubie, zrzuty ekranu kalkulatora) i numer wersji w nagłówku aplikacji do v1.8. Cały panel kalkulacji zyskał też zwijanie/rozwijanie jednym kliknięciem, analogicznie do panelu Danych Klienta. Ostrzeżenia o PGL poniżej bazy i marży poniżej minimum stały się też wyraźnie widoczne - zamiast drobnego żółtego tekstu pokazują się teraz jako czerwono obramowany, pogrubiony komunikat. Złom w podsumowaniu SSC przestał być stałą kwotą 10 €/t — jest teraz % ceny wsadu (domyślnie 2%), konfigurowalny przez administratora w Ustawieniach. Poprawiono też historię zmian cen bazowych PGL, która nie rejestrowała zmian wprowadzanych przez harmonogram kwartalny (edycję ceny bieżącego kwartału) — teraz trafiają do tego samego logu co ręczne zmiany.</w:t>
+              <w:t>Dodano opcjonalny komentarz do pozycji z niezerową dopłatą dodatkową w kalkulatorze. Pole komentarza oraz osobny checkbox „Dołącz komentarz do PDF” pojawiają się dopiero po wpisaniu wartości różnej od zera, a treść zapisuje się razem z resztą konfiguracji pozycji (odtwarzana przy edycji, nieusuwana przy chwilowym wyzerowaniu dopłaty). Po zaznaczeniu checkboxa komentarz trafia jako dodatkowy wpis do kolumny „Uwagi” w PDF oferty, we wszystkich miejscach eksportu (kalkulator, Moje oferty, Panel seniora, Panel administratora). Dodano również gatunek jednorazowy — możliwość wyceny gatunku spoza cennika (nazwa + dopłata EUR/t) w obrębie jednej oferty, bez dopisywania go do cennika i bez wpływu na pozostałe oferty. Dodano też opcję odbioru własnego w transporcie — checkbox w panelu „Trasa i transport” ustawia transport na 0 €/t, gdy klient sam odbiera towar spod zakładu. Dodano też harmonogram kwartalny PGL bazowego: administrator planuje ceny na Q1–Q4 wybranego roku osobno dla każdego typu stali, a kalkulator przełącza się na cenę danego kwartału automatycznie z chwilą jego rozpoczęcia. Tabela w panelu administratora pokazuje obok siebie cenę bieżącego miesiąca i wszystkie cztery kwartały. Funkcja wymaga migracji bazy danych (021_create_pgl_quarterly_prices.sql). Poprawiono też zapis ustawień, który przy aktywnej cenie kwartalnej nadpisywał nią ręczną cenę bazową PGL, oraz zaktualizowano dokumentację repozytorium (README, opis „About” na GitHubie, zrzuty ekranu kalkulatora) i numer wersji w nagłówku aplikacji do v1.8. Cały panel kalkulacji zyskał też zwijanie/rozwijanie jednym kliknięciem, analogicznie do panelu Danych Klienta. Ostrzeżenia o PGL poniżej bazy i marży poniżej minimum stały się też wyraźnie widoczne - zamiast drobnego żółtego tekstu pokazują się teraz jako czerwono obramowany, pogrubiony komunikat. Złom w podsumowaniu SSC przestał być stałą kwotą 10 €/t — jest teraz % ceny wsadu (domyślnie 2%), konfigurowalny przez administratora w Ustawieniach. Poprawiono też historię zmian cen bazowych PGL, która nie rejestrowała zmian wprowadzanych przez harmonogram kwartalny (edycję ceny bieżącego kwartału) — teraz trafiają do tego samego logu co ręczne zmiany. Dodano też okres ważności oferty: pola „Ważna od”/„Ważna do” obok przełącznika Arkusz/Krąg. Kwartał wyznaczony z daty „Ważna od” automatycznie dobiera PGL bazowe zaplanowane w harmonogramie kwartalnym dla tego okresu, tą samą logiką co dotychczasowe przełączanie na bieżący kwartał — tylko sparametryzowaną wybranym okresem zamiast „teraz”. Gdy zakres „od”–„do” wykracza poza jeden kwartał, PGL nie jest dobierane automatycznie i pojawia się czerwone ostrzeżenie. Wybrany zakres dat trafia też dodatkowo do stopki PDF oferty, obok dotychczasowej formułki o 48-godzinnej ważności oferty.</w:t>
             </w:r>
           </w:p>
         </w:tc>
@@ -983,6 +983,28 @@
           </w:tcPr>
           <w:p>
             <w:r>
+              <w:t>Nowa funkcja</w:t>
+            </w:r>
+          </w:p>
+        </w:tc>
+        <w:tc>
+          <w:tcPr>
+            <w:tcW w:w="6908" w:type="dxa"/>
+          </w:tcPr>
+          <w:p>
+            <w:r>
+              <w:t>Okres ważności oferty — obok przełącznika Arkusz/Krąg doszły dwa pola daty, „Ważna od” i „Ważna do”, określające okres, na jaki wyceniana jest oferta. Kwartał wyznaczony z daty „Ważna od” automatycznie dobiera PGL bazowe zaplanowane w harmonogramie kwartalnym (patrz wyżej, harmonogram kwartalny PGL) dla tego kwartału — dokładnie tą samą logiką co dotychczasowe przełączanie na bieżący kwartał, tylko sparametryzowaną wybranym okresem zamiast „teraz”. Gdy zakres „od”–„do” wykracza poza jeden kwartał, PGL nie jest dobierane automatycznie i pojawia się czerwone ostrzeżenie — administrator planuje ceny per kwartał, więc taki zakres byłby niejednoznaczny. Zmiana typu stali po ustawieniu okresu nadal resetuje PGL do wartości dla nowego typu w tym samym kwartale. Obie daty zapisują się razem z resztą oferty (jak dotychczasowy pglBase/transport) i odtwarzają się przy ponownym otwarciu bez ponownego przeliczania — zapisana oferta zachowuje PGL z dnia wyceny, tak samo jak przy zwykłej zmianie typu stali.</w:t>
+            </w:r>
+          </w:p>
+        </w:tc>
+      </w:tr>
+      <w:tr>
+        <w:tc>
+          <w:tcPr>
+            <w:tcW w:w="1948" w:type="dxa"/>
+          </w:tcPr>
+          <w:p>
+            <w:r>
               <w:t>Poprawka</w:t>
             </w:r>
           </w:p>
@@ -1231,7 +1253,7 @@
           </w:tcPr>
           <w:p>
             <w:r>
-              <w:t>Zmiana</w:t>
+              <w:t>Nowa funkcja</w:t>
             </w:r>
           </w:p>
         </w:tc>
@@ -1241,7 +1263,7 @@
           </w:tcPr>
           <w:p>
             <w:r>
-              <w:t>(w przygotowaniu)</w:t>
+              <w:t>Okres ważności oferty w PDF — gdy w kalkulatorze wypełniono obie daty „Ważna od”/„Ważna do”, w stopce oferty pojawia się dodatkowa linijka z wybranym zakresem dat, obok dotychczasowej stałej formułki „Ważność oferty: 48h od daty wystawienia” (która zostaje bez zmian). Linijka renderuje się we wszystkich czterech językach interfejsu (PL/EN/CS/DE) i znika, gdy okres nie został ustawiony — stare oferty bez tych pól nie tracą nic ze swojego PDF-u.</w:t>
             </w:r>
           </w:p>
         </w:tc>

</xml_diff>

<commit_message>
fix: scrap surcharge rounded to whole number per management directive
Złom (scrap surcharge, % of input price) was showing/computing with
2 decimal places. Rounded to a whole currency unit at calculation
time so it also flows correctly into SSC total and final price, not
just the displayed line item. Updated v1.8 version report.

Co-Authored-By: Claude Sonnet 5 <noreply@anthropic.com>
Claude-Session: https://claude.ai/code/session_012rCuz8AjpGEG7KGbLFBr8t
</commit_message>
<xml_diff>
--- a/Historia wersji oraz md/Historia wersji/AMSteel_Quote_Raport_Wersji_1.8.docx
+++ b/Historia wersji oraz md/Historia wersji/AMSteel_Quote_Raport_Wersji_1.8.docx
@@ -282,7 +282,7 @@
           </w:tcPr>
           <w:p>
             <w:r>
-              <w:t>Dodano opcjonalny komentarz do pozycji z niezerową dopłatą dodatkową w kalkulatorze. Pole komentarza oraz osobny checkbox „Dołącz komentarz do PDF” pojawiają się dopiero po wpisaniu wartości różnej od zera, a treść zapisuje się razem z resztą konfiguracji pozycji (odtwarzana przy edycji, nieusuwana przy chwilowym wyzerowaniu dopłaty). Po zaznaczeniu checkboxa komentarz trafia jako dodatkowy wpis do kolumny „Uwagi” w PDF oferty, we wszystkich miejscach eksportu (kalkulator, Moje oferty, Panel seniora, Panel administratora). Dodano również gatunek jednorazowy — możliwość wyceny gatunku spoza cennika (nazwa + dopłata EUR/t) w obrębie jednej oferty, bez dopisywania go do cennika i bez wpływu na pozostałe oferty. Dodano też opcję odbioru własnego w transporcie — checkbox w panelu „Trasa i transport” ustawia transport na 0 €/t, gdy klient sam odbiera towar spod zakładu. Dodano też harmonogram kwartalny PGL bazowego: administrator planuje ceny na Q1–Q4 wybranego roku osobno dla każdego typu stali, a kalkulator przełącza się na cenę danego kwartału automatycznie z chwilą jego rozpoczęcia. Tabela w panelu administratora pokazuje obok siebie cenę bieżącego miesiąca i wszystkie cztery kwartały. Funkcja wymaga migracji bazy danych (021_create_pgl_quarterly_prices.sql). Poprawiono też zapis ustawień, który przy aktywnej cenie kwartalnej nadpisywał nią ręczną cenę bazową PGL, oraz zaktualizowano dokumentację repozytorium (README, opis „About” na GitHubie, zrzuty ekranu kalkulatora) i numer wersji w nagłówku aplikacji do v1.8. Cały panel kalkulacji zyskał też zwijanie/rozwijanie jednym kliknięciem, analogicznie do panelu Danych Klienta. Ostrzeżenia o PGL poniżej bazy i marży poniżej minimum stały się też wyraźnie widoczne - zamiast drobnego żółtego tekstu pokazują się teraz jako czerwono obramowany, pogrubiony komunikat. Złom w podsumowaniu SSC przestał być stałą kwotą 10 €/t — jest teraz % ceny wsadu (domyślnie 2%), konfigurowalny przez administratora w Ustawieniach. Poprawiono też historię zmian cen bazowych PGL, która nie rejestrowała zmian wprowadzanych przez harmonogram kwartalny (edycję ceny bieżącego kwartału) — teraz trafiają do tego samego logu co ręczne zmiany. Dodano też okres ważności oferty: pola „Ważna od”/„Ważna do” obok przełącznika Arkusz/Krąg. Kwartał wyznaczony z daty „Ważna od” automatycznie dobiera PGL bazowe zaplanowane w harmonogramie kwartalnym dla tego okresu, tą samą logiką co dotychczasowe przełączanie na bieżący kwartał — tylko sparametryzowaną wybranym okresem zamiast „teraz”. Gdy zakres „od”–„do” wykracza poza jeden kwartał, PGL nie jest dobierane automatycznie i pojawia się czerwone ostrzeżenie. Wybrany zakres dat trafia też dodatkowo do stopki PDF oferty, obok dotychczasowej formułki o 48-godzinnej ważności oferty.</w:t>
+              <w:t>Dodano opcjonalny komentarz do pozycji z niezerową dopłatą dodatkową w kalkulatorze. Pole komentarza oraz osobny checkbox „Dołącz komentarz do PDF” pojawiają się dopiero po wpisaniu wartości różnej od zera, a treść zapisuje się razem z resztą konfiguracji pozycji (odtwarzana przy edycji, nieusuwana przy chwilowym wyzerowaniu dopłaty). Po zaznaczeniu checkboxa komentarz trafia jako dodatkowy wpis do kolumny „Uwagi” w PDF oferty, we wszystkich miejscach eksportu (kalkulator, Moje oferty, Panel seniora, Panel administratora). Dodano również gatunek jednorazowy — możliwość wyceny gatunku spoza cennika (nazwa + dopłata EUR/t) w obrębie jednej oferty, bez dopisywania go do cennika i bez wpływu na pozostałe oferty. Dodano też opcję odbioru własnego w transporcie — checkbox w panelu „Trasa i transport” ustawia transport na 0 €/t, gdy klient sam odbiera towar spod zakładu. Dodano też harmonogram kwartalny PGL bazowego: administrator planuje ceny na Q1–Q4 wybranego roku osobno dla każdego typu stali, a kalkulator przełącza się na cenę danego kwartału automatycznie z chwilą jego rozpoczęcia. Tabela w panelu administratora pokazuje obok siebie cenę bieżącego miesiąca i wszystkie cztery kwartały. Funkcja wymaga migracji bazy danych (021_create_pgl_quarterly_prices.sql). Poprawiono też zapis ustawień, który przy aktywnej cenie kwartalnej nadpisywał nią ręczną cenę bazową PGL, oraz zaktualizowano dokumentację repozytorium (README, opis „About” na GitHubie, zrzuty ekranu kalkulatora) i numer wersji w nagłówku aplikacji do v1.8. Cały panel kalkulacji zyskał też zwijanie/rozwijanie jednym kliknięciem, analogicznie do panelu Danych Klienta. Ostrzeżenia o PGL poniżej bazy i marży poniżej minimum stały się też wyraźnie widoczne - zamiast drobnego żółtego tekstu pokazują się teraz jako czerwono obramowany, pogrubiony komunikat. Złom w podsumowaniu SSC przestał być stałą kwotą 10 €/t — jest teraz % ceny wsadu (domyślnie 2%), konfigurowalny przez administratora w Ustawieniach. Poprawiono też historię zmian cen bazowych PGL, która nie rejestrowała zmian wprowadzanych przez harmonogram kwartalny (edycję ceny bieżącego kwartału) — teraz trafiają do tego samego logu co ręczne zmiany. Dodano też okres ważności oferty: pola „Ważna od”/„Ważna do” obok przełącznika Arkusz/Krąg. Kwartał wyznaczony z daty „Ważna od” automatycznie dobiera PGL bazowe zaplanowane w harmonogramie kwartalnym dla tego okresu, tą samą logiką co dotychczasowe przełączanie na bieżący kwartał — tylko sparametryzowaną wybranym okresem zamiast „teraz”. Gdy zakres „od”–„do” wykracza poza jeden kwartał, PGL nie jest dobierane automatycznie i pojawia się czerwone ostrzeżenie. Wybrany zakres dat trafia też dodatkowo do stopki PDF oferty, obok dotychczasowej formułki o 48-godzinnej ważności oferty. Kwota złomu w podsumowaniu SSC jest teraz zaokrąglana do liczby całkowitej, na polecenie zarządu.</w:t>
             </w:r>
           </w:p>
         </w:tc>
@@ -1086,6 +1086,28 @@
           </w:p>
         </w:tc>
       </w:tr>
+      <w:tr>
+        <w:tc>
+          <w:tcPr>
+            <w:tcW w:w="1948" w:type="dxa"/>
+          </w:tcPr>
+          <w:p>
+            <w:r>
+              <w:t>Zmiana</w:t>
+            </w:r>
+          </w:p>
+        </w:tc>
+        <w:tc>
+          <w:tcPr>
+            <w:tcW w:w="6908" w:type="dxa"/>
+          </w:tcPr>
+          <w:p>
+            <w:r>
+              <w:t>Złom zaokrąglony do liczby całkowitej — na polecenie zarządu kwota złomu w podsumowaniu SSC (obliczana jako % ceny wsadu) jest teraz zaokrąglana do pełnej jednostki waluty, zamiast dotychczasowych dwóch miejsc po przecinku. Zaokrąglenie następuje na poziomie obliczeń, więc wpływa też na sumę SSC i cenę końcową pozycji, nie tylko na sam wygląd wiersza „Złom”.</w:t>
+            </w:r>
+          </w:p>
+        </w:tc>
+      </w:tr>
     </w:tbl>
     <w:p>
       <w:pPr>

</xml_diff>

<commit_message>
feat: payment term (from-to date range) beside offer validity period
Adds a "Termin platnosci od/do" field pair in the calculator, next to
"Wazna od/do", independent of the offer validity period. Picking "od"
auto-fills "do" as od + N days (client's own term if set in the new
Klienci panel, editable by senior + admin, else the global default
from Ustawienia) - "do" stays fully editable and is recalculated each
time "od" changes. The PDF footer now shows the term range in place
of the generic "wg ustalen indywidualnych" note when both dates are
set. Requires migration 023_add_payment_term.sql. Updated v1.8
version report.

Co-Authored-By: Claude Sonnet 5 <noreply@anthropic.com>
Claude-Session: https://claude.ai/code/session_01QSVdP8k56vhoPxvJEmqHDk
</commit_message>
<xml_diff>
--- a/Historia wersji oraz md/Historia wersji/AMSteel_Quote_Raport_Wersji_1.8.docx
+++ b/Historia wersji oraz md/Historia wersji/AMSteel_Quote_Raport_Wersji_1.8.docx
@@ -282,7 +282,7 @@
           </w:tcPr>
           <w:p>
             <w:r>
-              <w:t>Dodano opcjonalny komentarz do pozycji z niezerową dopłatą dodatkową w kalkulatorze. Pole komentarza oraz osobny checkbox „Dołącz komentarz do PDF” pojawiają się dopiero po wpisaniu wartości różnej od zera, a treść zapisuje się razem z resztą konfiguracji pozycji (odtwarzana przy edycji, nieusuwana przy chwilowym wyzerowaniu dopłaty). Po zaznaczeniu checkboxa komentarz trafia jako dodatkowy wpis do kolumny „Uwagi” w PDF oferty, we wszystkich miejscach eksportu (kalkulator, Moje oferty, Panel seniora, Panel administratora). Dodano również gatunek jednorazowy — możliwość wyceny gatunku spoza cennika (nazwa + dopłata EUR/t) w obrębie jednej oferty, bez dopisywania go do cennika i bez wpływu na pozostałe oferty. Dodano też opcję odbioru własnego w transporcie — checkbox w panelu „Trasa i transport” ustawia transport na 0 €/t, gdy klient sam odbiera towar spod zakładu. Dodano też harmonogram kwartalny PGL bazowego: administrator planuje ceny na Q1–Q4 wybranego roku osobno dla każdego typu stali, a kalkulator przełącza się na cenę danego kwartału automatycznie z chwilą jego rozpoczęcia. Tabela w panelu administratora pokazuje obok siebie cenę bieżącego miesiąca i wszystkie cztery kwartały. Funkcja wymaga migracji bazy danych (021_create_pgl_quarterly_prices.sql). Poprawiono też zapis ustawień, który przy aktywnej cenie kwartalnej nadpisywał nią ręczną cenę bazową PGL, oraz zaktualizowano dokumentację repozytorium (README, opis „About” na GitHubie, zrzuty ekranu kalkulatora) i numer wersji w nagłówku aplikacji do v1.8. Cały panel kalkulacji zyskał też zwijanie/rozwijanie jednym kliknięciem, analogicznie do panelu Danych Klienta. Ostrzeżenia o PGL poniżej bazy i marży poniżej minimum stały się też wyraźnie widoczne - zamiast drobnego żółtego tekstu pokazują się teraz jako czerwono obramowany, pogrubiony komunikat. Złom w podsumowaniu SSC przestał być stałą kwotą 10 €/t — jest teraz % ceny wsadu (domyślnie 2%), konfigurowalny przez administratora w Ustawieniach. Poprawiono też historię zmian cen bazowych PGL, która nie rejestrowała zmian wprowadzanych przez harmonogram kwartalny (edycję ceny bieżącego kwartału) — teraz trafiają do tego samego logu co ręczne zmiany. Dodano też okres ważności oferty: pola „Ważna od”/„Ważna do” obok przełącznika Arkusz/Krąg. Kwartał wyznaczony z daty „Ważna od” automatycznie dobiera PGL bazowe zaplanowane w harmonogramie kwartalnym dla tego okresu, tą samą logiką co dotychczasowe przełączanie na bieżący kwartał — tylko sparametryzowaną wybranym okresem zamiast „teraz”. Gdy zakres „od”–„do” wykracza poza jeden kwartał, PGL nie jest dobierane automatycznie i pojawia się czerwone ostrzeżenie. Wybrany zakres dat trafia też dodatkowo do stopki PDF oferty, obok dotychczasowej formułki o 48-godzinnej ważności oferty. Kwota złomu w podsumowaniu SSC jest teraz zaokrąglana do liczby całkowitej, na polecenie zarządu.</w:t>
+              <w:t>Dodano opcjonalny komentarz do pozycji z niezerową dopłatą dodatkową w kalkulatorze. Pole komentarza oraz osobny checkbox „Dołącz komentarz do PDF” pojawiają się dopiero po wpisaniu wartości różnej od zera, a treść zapisuje się razem z resztą konfiguracji pozycji (odtwarzana przy edycji, nieusuwana przy chwilowym wyzerowaniu dopłaty). Po zaznaczeniu checkboxa komentarz trafia jako dodatkowy wpis do kolumny „Uwagi” w PDF oferty, we wszystkich miejscach eksportu (kalkulator, Moje oferty, Panel seniora, Panel administratora). Dodano również gatunek jednorazowy — możliwość wyceny gatunku spoza cennika (nazwa + dopłata EUR/t) w obrębie jednej oferty, bez dopisywania go do cennika i bez wpływu na pozostałe oferty. Dodano też opcję odbioru własnego w transporcie — checkbox w panelu „Trasa i transport” ustawia transport na 0 €/t, gdy klient sam odbiera towar spod zakładu. Dodano też harmonogram kwartalny PGL bazowego: administrator planuje ceny na Q1–Q4 wybranego roku osobno dla każdego typu stali, a kalkulator przełącza się na cenę danego kwartału automatycznie z chwilą jego rozpoczęcia. Tabela w panelu administratora pokazuje obok siebie cenę bieżącego miesiąca i wszystkie cztery kwartały. Funkcja wymaga migracji bazy danych (021_create_pgl_quarterly_prices.sql). Poprawiono też zapis ustawień, który przy aktywnej cenie kwartalnej nadpisywał nią ręczną cenę bazową PGL, oraz zaktualizowano dokumentację repozytorium (README, opis „About” na GitHubie, zrzuty ekranu kalkulatora) i numer wersji w nagłówku aplikacji do v1.8. Cały panel kalkulacji zyskał też zwijanie/rozwijanie jednym kliknięciem, analogicznie do panelu Danych Klienta. Ostrzeżenia o PGL poniżej bazy i marży poniżej minimum stały się też wyraźnie widoczne - zamiast drobnego żółtego tekstu pokazują się teraz jako czerwono obramowany, pogrubiony komunikat. Złom w podsumowaniu SSC przestał być stałą kwotą 10 €/t — jest teraz % ceny wsadu (domyślnie 2%), konfigurowalny przez administratora w Ustawieniach. Poprawiono też historię zmian cen bazowych PGL, która nie rejestrowała zmian wprowadzanych przez harmonogram kwartalny (edycję ceny bieżącego kwartału) — teraz trafiają do tego samego logu co ręczne zmiany. Dodano też okres ważności oferty: pola „Ważna od”/„Ważna do” obok przełącznika Arkusz/Krąg. Kwartał wyznaczony z daty „Ważna od” automatycznie dobiera PGL bazowe zaplanowane w harmonogramie kwartalnym dla tego okresu, tą samą logiką co dotychczasowe przełączanie na bieżący kwartał — tylko sparametryzowaną wybranym okresem zamiast „teraz”. Gdy zakres „od”–„do” wykracza poza jeden kwartał, PGL nie jest dobierane automatycznie i pojawia się czerwone ostrzeżenie. Wybrany zakres dat trafia też dodatkowo do stopki PDF oferty, obok dotychczasowej formułki o 48-godzinnej ważności oferty. Kwota złomu w podsumowaniu SSC jest teraz zaokrąglana do liczby całkowitej, na polecenie zarządu. Dodano też termin płatności: osobna para pól „od”/„do” obok okresu ważności oferty, gdzie „do” domyślnie dolicza się jako „od” + termin klienta (konfigurowalny w panelu Klienci, dostępnym też dla starszego handlowca) albo globalny domyślny z Ustawień (domyślnie 7 dni), z możliwością ręcznej zmiany; ustawiony termin trafia też do stopki PDF, zastępując ogólną formułkę o warunkach płatności.</w:t>
             </w:r>
           </w:p>
         </w:tc>
@@ -1108,6 +1108,28 @@
           </w:p>
         </w:tc>
       </w:tr>
+      <w:tr>
+        <w:tc>
+          <w:tcPr>
+            <w:tcW w:w="1948" w:type="dxa"/>
+          </w:tcPr>
+          <w:p>
+            <w:r>
+              <w:t>Nowa funkcja</w:t>
+            </w:r>
+          </w:p>
+        </w:tc>
+        <w:tc>
+          <w:tcPr>
+            <w:tcW w:w="6908" w:type="dxa"/>
+          </w:tcPr>
+          <w:p>
+            <w:r>
+              <w:t>Termin płatności — obok pól „Ważna od”/„Ważna do” (okres ważności oferty) doszła osobna para pól „Termin płatności od” i „Termin płatności do”, niezależna od okresu ważności. Wybranie daty „od” automatycznie dolicza „do” jako „od” + liczba dni — indywidualny termin przypisany klientowi, jeśli taki ma, albo globalny termin domyślny ustawiony w Ustawieniach (domyślnie 7 dni), ale pole „do” zostaje w pełni edytowalne ręcznie — ponowna zmiana „od” przelicza je od nowa. Panel „Klienci” pozwala przypisać każdej firmie własny termin płatności w dniach (puste pole = dziedziczenie globalnego domyślnego); dostępny jest teraz nie tylko dla administratora (/admin/klienci), ale też dla starszego handlowca w nowej zakładce „Klienci” w Panelu Seniora, gdzie może zmieniać wyłącznie ten jeden parametr klienta — ograniczenie wymuszone po stronie serwera, nie tylko ukryte w interfejsie. Administrator konfiguruje globalny domyślny termin w Ustawieniach (nowe pole „Domyślny termin płatności (dni)”, walidacja 0–365, ten sam mechanizm co minimalna marża czy złom). Funkcja wymaga migracji bazy danych (023_add_payment_term.sql, kolumny app_settings.payment_term_days i clients.payment_term_days).</w:t>
+            </w:r>
+          </w:p>
+        </w:tc>
+      </w:tr>
     </w:tbl>
     <w:p>
       <w:pPr>
@@ -1290,6 +1312,28 @@
           </w:p>
         </w:tc>
       </w:tr>
+      <w:tr>
+        <w:tc>
+          <w:tcPr>
+            <w:tcW w:w="1948" w:type="dxa"/>
+          </w:tcPr>
+          <w:p>
+            <w:r>
+              <w:t>Nowa funkcja</w:t>
+            </w:r>
+          </w:p>
+        </w:tc>
+        <w:tc>
+          <w:tcPr>
+            <w:tcW w:w="6908" w:type="dxa"/>
+          </w:tcPr>
+          <w:p>
+            <w:r>
+              <w:t>Termin płatności w PDF — gdy w kalkulatorze wypełniono obie daty „Termin płatności od”/„do”, w stopce oferty pojawia się linijka „Termin płatności: {od} – {do}.”, która ZASTĘPUJE dotychczasową ogólną formułkę „Warunki płatności: wg ustaleń indywidualnych” (formułka wraca, gdy termin nie został ustawiony). Renderuje się we wszystkich czterech językach interfejsu (PL/EN/CS/DE), niezależnie od istniejącej linijki okresu ważności oferty.</w:t>
+            </w:r>
+          </w:p>
+        </w:tc>
+      </w:tr>
     </w:tbl>
     <w:p>
       <w:pPr>
@@ -1462,14 +1506,6 @@
       </w:pPr>
       <w:r>
         <w:t>Testy ręczne end-to-end wszystkich trzech ról i pełnego obiegu oferty na środowisku hostingowym</w:t>
-      </w:r>
-    </w:p>
-    <w:p>
-      <w:pPr>
-        <w:pStyle w:val="Listapunktowana"/>
-      </w:pPr>
-      <w:r>
-        <w:t>Dodanie tabelki z terminem płatności</w:t>
       </w:r>
     </w:p>
     <w:p>

</xml_diff>

<commit_message>
fix: PDF offer totals no longer repeat per page; fix column drift at 5-digit prices
Totals row lived in <tfoot> of the same table as line items; Chrome's
HTML->PDF print engine repeats <thead>/<tfoot> on every page a table
spans across, so with more than ~2 items the totals bar showed after
every page instead of only after the last item. Moved totals into a
separate table after the items table so it renders exactly once.

Also switched to table-layout: fixed with a shared colgroup and wider
price/value columns + nowrap, fixing text drift/overlap that showed up
once a price or value hit 5 digits (common in PLN after conversion).

Affected both EUR and PLN offers, since the template is shared.

Co-Authored-By: Claude Sonnet 5 <noreply@anthropic.com>
Claude-Session: https://claude.ai/code/session_01KZiCsDcxAQJpXxZpwzzRCn
</commit_message>
<xml_diff>
--- a/Historia wersji oraz md/Historia wersji/AMSteel_Quote_Raport_Wersji_1.8.docx
+++ b/Historia wersji oraz md/Historia wersji/AMSteel_Quote_Raport_Wersji_1.8.docx
@@ -282,7 +282,7 @@
           </w:tcPr>
           <w:p>
             <w:r>
-              <w:t>Dodano opcjonalny komentarz do pozycji z niezerową dopłatą dodatkową w kalkulatorze. Pole komentarza oraz osobny checkbox „Dołącz komentarz do PDF” pojawiają się dopiero po wpisaniu wartości różnej od zera, a treść zapisuje się razem z resztą konfiguracji pozycji (odtwarzana przy edycji, nieusuwana przy chwilowym wyzerowaniu dopłaty). Po zaznaczeniu checkboxa komentarz trafia jako dodatkowy wpis do kolumny „Uwagi” w PDF oferty, we wszystkich miejscach eksportu (kalkulator, Moje oferty, Panel seniora, Panel administratora). Dodano również gatunek jednorazowy — możliwość wyceny gatunku spoza cennika (nazwa + dopłata EUR/t) w obrębie jednej oferty, bez dopisywania go do cennika i bez wpływu na pozostałe oferty. Dodano też opcję odbioru własnego w transporcie — checkbox w panelu „Trasa i transport” ustawia transport na 0 €/t, gdy klient sam odbiera towar spod zakładu. Dodano też harmonogram kwartalny PGL bazowego: administrator planuje ceny na Q1–Q4 wybranego roku osobno dla każdego typu stali, a kalkulator przełącza się na cenę danego kwartału automatycznie z chwilą jego rozpoczęcia. Tabela w panelu administratora pokazuje obok siebie cenę bieżącego miesiąca i wszystkie cztery kwartały. Funkcja wymaga migracji bazy danych (021_create_pgl_quarterly_prices.sql). Poprawiono też zapis ustawień, który przy aktywnej cenie kwartalnej nadpisywał nią ręczną cenę bazową PGL, oraz zaktualizowano dokumentację repozytorium (README, opis „About” na GitHubie, zrzuty ekranu kalkulatora) i numer wersji w nagłówku aplikacji do v1.8. Cały panel kalkulacji zyskał też zwijanie/rozwijanie jednym kliknięciem, analogicznie do panelu Danych Klienta. Ostrzeżenia o PGL poniżej bazy i marży poniżej minimum stały się też wyraźnie widoczne - zamiast drobnego żółtego tekstu pokazują się teraz jako czerwono obramowany, pogrubiony komunikat. Złom w podsumowaniu SSC przestał być stałą kwotą 10 €/t — jest teraz % ceny wsadu (domyślnie 2%), konfigurowalny przez administratora w Ustawieniach. Poprawiono też historię zmian cen bazowych PGL, która nie rejestrowała zmian wprowadzanych przez harmonogram kwartalny (edycję ceny bieżącego kwartału) — teraz trafiają do tego samego logu co ręczne zmiany. Dodano też okres ważności oferty: pola „Ważna od”/„Ważna do” obok przełącznika Arkusz/Krąg. Kwartał wyznaczony z daty „Ważna od” automatycznie dobiera PGL bazowe zaplanowane w harmonogramie kwartalnym dla tego okresu, tą samą logiką co dotychczasowe przełączanie na bieżący kwartał — tylko sparametryzowaną wybranym okresem zamiast „teraz”. Gdy zakres „od”–„do” wykracza poza jeden kwartał, PGL nie jest dobierane automatycznie i pojawia się czerwone ostrzeżenie. Wybrany zakres dat trafia też dodatkowo do stopki PDF oferty, obok dotychczasowej formułki o 48-godzinnej ważności oferty. Kwota złomu w podsumowaniu SSC jest teraz zaokrąglana do liczby całkowitej, na polecenie zarządu. Dodano też termin płatności: osobna para pól „od”/„do” obok okresu ważności oferty, gdzie „do” domyślnie dolicza się jako „od” + termin klienta (konfigurowalny w panelu Klienci, dostępnym też dla starszego handlowca) albo globalny domyślny z Ustawień (domyślnie 7 dni), z możliwością ręcznej zmiany; ustawiony termin trafia też do stopki PDF, zastępując ogólną formułkę o warunkach płatności.</w:t>
+              <w:t>Dodano opcjonalny komentarz do pozycji z niezerową dopłatą dodatkową w kalkulatorze. Pole komentarza oraz osobny checkbox „Dołącz komentarz do PDF” pojawiają się dopiero po wpisaniu wartości różnej od zera, a treść zapisuje się razem z resztą konfiguracji pozycji (odtwarzana przy edycji, nieusuwana przy chwilowym wyzerowaniu dopłaty). Po zaznaczeniu checkboxa komentarz trafia jako dodatkowy wpis do kolumny „Uwagi” w PDF oferty, we wszystkich miejscach eksportu (kalkulator, Moje oferty, Panel seniora, Panel administratora). Dodano również gatunek jednorazowy — możliwość wyceny gatunku spoza cennika (nazwa + dopłata EUR/t) w obrębie jednej oferty, bez dopisywania go do cennika i bez wpływu na pozostałe oferty. Dodano też opcję odbioru własnego w transporcie — checkbox w panelu „Trasa i transport” ustawia transport na 0 €/t, gdy klient sam odbiera towar spod zakładu. Dodano też harmonogram kwartalny PGL bazowego: administrator planuje ceny na Q1–Q4 wybranego roku osobno dla każdego typu stali, a kalkulator przełącza się na cenę danego kwartału automatycznie z chwilą jego rozpoczęcia. Tabela w panelu administratora pokazuje obok siebie cenę bieżącego miesiąca i wszystkie cztery kwartały. Funkcja wymaga migracji bazy danych (021_create_pgl_quarterly_prices.sql). Poprawiono też zapis ustawień, który przy aktywnej cenie kwartalnej nadpisywał nią ręczną cenę bazową PGL, oraz zaktualizowano dokumentację repozytorium (README, opis „About” na GitHubie, zrzuty ekranu kalkulatora) i numer wersji w nagłówku aplikacji do v1.8. Cały panel kalkulacji zyskał też zwijanie/rozwijanie jednym kliknięciem, analogicznie do panelu Danych Klienta. Ostrzeżenia o PGL poniżej bazy i marży poniżej minimum stały się też wyraźnie widoczne - zamiast drobnego żółtego tekstu pokazują się teraz jako czerwono obramowany, pogrubiony komunikat. Złom w podsumowaniu SSC przestał być stałą kwotą 10 €/t — jest teraz % ceny wsadu (domyślnie 2%), konfigurowalny przez administratora w Ustawieniach. Poprawiono też historię zmian cen bazowych PGL, która nie rejestrowała zmian wprowadzanych przez harmonogram kwartalny (edycję ceny bieżącego kwartału) — teraz trafiają do tego samego logu co ręczne zmiany. Dodano też okres ważności oferty: pola „Ważna od”/„Ważna do” obok przełącznika Arkusz/Krąg. Kwartał wyznaczony z daty „Ważna od” automatycznie dobiera PGL bazowe zaplanowane w harmonogramie kwartalnym dla tego okresu, tą samą logiką co dotychczasowe przełączanie na bieżący kwartał — tylko sparametryzowaną wybranym okresem zamiast „teraz”. Gdy zakres „od”–„do” wykracza poza jeden kwartał, PGL nie jest dobierane automatycznie i pojawia się czerwone ostrzeżenie. Wybrany zakres dat trafia też dodatkowo do stopki PDF oferty, obok dotychczasowej formułki o 48-godzinnej ważności oferty. Kwota złomu w podsumowaniu SSC jest teraz zaokrąglana do liczby całkowitej, na polecenie zarządu. Dodano też termin płatności: osobna para pól „od”/„do” obok okresu ważności oferty, gdzie „do” domyślnie dolicza się jako „od” + termin klienta (konfigurowalny w panelu Klienci, dostępnym też dla starszego handlowca) albo globalny domyślny z Ustawień (domyślnie 7 dni), z możliwością ręcznej zmiany; ustawiony termin trafia też do stopki PDF, zastępując ogólną formułkę o warunkach płatności. Poprawiono też PDF oferty: podsumowanie sumy przestało powtarzać się po każdej stronie tabeli pozycji (pokazuje się teraz raz, po ostatniej pozycji), a tekst w kolumnach „Cena”/„Wartość” przestał się rozjeżdżać przy pięciocyfrowych kwotach.</w:t>
             </w:r>
           </w:p>
         </w:tc>
@@ -1334,6 +1334,50 @@
           </w:p>
         </w:tc>
       </w:tr>
+      <w:tr>
+        <w:tc>
+          <w:tcPr>
+            <w:tcW w:w="1948" w:type="dxa"/>
+          </w:tcPr>
+          <w:p>
+            <w:r>
+              <w:t>Poprawka</w:t>
+            </w:r>
+          </w:p>
+        </w:tc>
+        <w:tc>
+          <w:tcPr>
+            <w:tcW w:w="6908" w:type="dxa"/>
+          </w:tcPr>
+          <w:p>
+            <w:r>
+              <w:t>Podsumowanie oferty (wiersz „RAZEM”) w PDF drukowało się po każdej stronie tabeli pozycji zamiast tylko po ostatniej — silnik konwersji HTML→PDF (Abacus, headless Chrome) powtarza nagłówek i stopkę tabeli na każdej stronie, na którą się ona rozleje, więc przy więcej niż ok. 2 pozycjach „RAZEM” pojawiało się po każdej stronie z osobną, niepełną sumą. Podsumowanie jest teraz osobną tabelą za tabelą pozycji, więc renderuje się dokładnie raz, bezpośrednio po ostatniej pozycji, niezależnie ile stron zajęły pozycje. Dotyczyło ofert w obu walutach (EUR i PLN).</w:t>
+            </w:r>
+          </w:p>
+        </w:tc>
+      </w:tr>
+      <w:tr>
+        <w:tc>
+          <w:tcPr>
+            <w:tcW w:w="1948" w:type="dxa"/>
+          </w:tcPr>
+          <w:p>
+            <w:r>
+              <w:t>Poprawka</w:t>
+            </w:r>
+          </w:p>
+        </w:tc>
+        <w:tc>
+          <w:tcPr>
+            <w:tcW w:w="6908" w:type="dxa"/>
+          </w:tcPr>
+          <w:p>
+            <w:r>
+              <w:t>Tekst w kolumnach „Cena”/„Wartość” rozjeżdżał się przy pięciocyfrowych kwotach (częste w ofertach PLN po przeliczeniu kursem) — tabela miała zmienną szerokość kolumn, więc mogła się ona przeliczać niespójnie. Kolumny mają teraz stałą, wspólną szerokość dla całej tabeli, kolumny „Cena” i „Wartość” zostały poszerzone, a liczby przestały się zawijać do kolejnej linii.</w:t>
+            </w:r>
+          </w:p>
+        </w:tc>
+      </w:tr>
     </w:tbl>
     <w:p>
       <w:pPr>

</xml_diff>

<commit_message>
feat: drag-and-drop reorder for zestawienie items with touch support + v1.8 report update
Rows in the Zestawienie (summary) table can now be reordered via a
dedicated drag handle, animated with framer-motion's Reorder; Lp.
numbering updates automatically and the new order flows through to
PDF/Excel export and saved offers unchanged. Handle uses touchAction:
none so dragging works reliably on phones/tablets, not just desktop
mouse (Reorder.Item only sets that CSS itself under its default
dragListener, which a custom handle opts out of).

Co-Authored-By: Claude Sonnet 5 <noreply@anthropic.com>
Claude-Session: https://claude.ai/code/session_01WdLPqKSLXGE5V1hoxEbSVG
</commit_message>
<xml_diff>
--- a/Historia wersji oraz md/Historia wersji/AMSteel_Quote_Raport_Wersji_1.8.docx
+++ b/Historia wersji oraz md/Historia wersji/AMSteel_Quote_Raport_Wersji_1.8.docx
@@ -282,7 +282,7 @@
           </w:tcPr>
           <w:p>
             <w:r>
-              <w:t>Dodano opcjonalny komentarz do pozycji z niezerową dopłatą dodatkową w kalkulatorze. Pole komentarza oraz osobny checkbox „Dołącz komentarz do PDF” pojawiają się dopiero po wpisaniu wartości różnej od zera, a treść zapisuje się razem z resztą konfiguracji pozycji (odtwarzana przy edycji, nieusuwana przy chwilowym wyzerowaniu dopłaty). Po zaznaczeniu checkboxa komentarz trafia jako dodatkowy wpis do kolumny „Uwagi” w PDF oferty, we wszystkich miejscach eksportu (kalkulator, Moje oferty, Panel seniora, Panel administratora). Dodano również gatunek jednorazowy — możliwość wyceny gatunku spoza cennika (nazwa + dopłata EUR/t) w obrębie jednej oferty, bez dopisywania go do cennika i bez wpływu na pozostałe oferty. Dodano też opcję odbioru własnego w transporcie — checkbox w panelu „Trasa i transport” ustawia transport na 0 €/t, gdy klient sam odbiera towar spod zakładu. Dodano też harmonogram kwartalny PGL bazowego: administrator planuje ceny na Q1–Q4 wybranego roku osobno dla każdego typu stali, a kalkulator przełącza się na cenę danego kwartału automatycznie z chwilą jego rozpoczęcia. Tabela w panelu administratora pokazuje obok siebie cenę bieżącego miesiąca i wszystkie cztery kwartały. Funkcja wymaga migracji bazy danych (021_create_pgl_quarterly_prices.sql). Poprawiono też zapis ustawień, który przy aktywnej cenie kwartalnej nadpisywał nią ręczną cenę bazową PGL, oraz zaktualizowano dokumentację repozytorium (README, opis „About” na GitHubie, zrzuty ekranu kalkulatora) i numer wersji w nagłówku aplikacji do v1.8. Cały panel kalkulacji zyskał też zwijanie/rozwijanie jednym kliknięciem, analogicznie do panelu Danych Klienta. Ostrzeżenia o PGL poniżej bazy i marży poniżej minimum stały się też wyraźnie widoczne - zamiast drobnego żółtego tekstu pokazują się teraz jako czerwono obramowany, pogrubiony komunikat. Złom w podsumowaniu SSC przestał być stałą kwotą 10 €/t — jest teraz % ceny wsadu (domyślnie 2%), konfigurowalny przez administratora w Ustawieniach. Poprawiono też historię zmian cen bazowych PGL, która nie rejestrowała zmian wprowadzanych przez harmonogram kwartalny (edycję ceny bieżącego kwartału) — teraz trafiają do tego samego logu co ręczne zmiany. Dodano też okres ważności oferty: pola „Ważna od”/„Ważna do” obok przełącznika Arkusz/Krąg. Kwartał wyznaczony z daty „Ważna od” automatycznie dobiera PGL bazowe zaplanowane w harmonogramie kwartalnym dla tego okresu, tą samą logiką co dotychczasowe przełączanie na bieżący kwartał — tylko sparametryzowaną wybranym okresem zamiast „teraz”. Gdy zakres „od”–„do” wykracza poza jeden kwartał, PGL nie jest dobierane automatycznie i pojawia się czerwone ostrzeżenie. Wybrany zakres dat trafia też dodatkowo do stopki PDF oferty, obok dotychczasowej formułki o 48-godzinnej ważności oferty. Kwota złomu w podsumowaniu SSC jest teraz zaokrąglana do liczby całkowitej, na polecenie zarządu. Dodano też termin płatności: osobna para pól „od”/„do” obok okresu ważności oferty, gdzie „do” domyślnie dolicza się jako „od” + termin klienta (konfigurowalny w panelu Klienci, dostępnym też dla starszego handlowca) albo globalny domyślny z Ustawień (domyślnie 7 dni), z możliwością ręcznej zmiany; ustawiony termin trafia też do stopki PDF, zastępując ogólną formułkę o warunkach płatności. Poprawiono też PDF oferty: podsumowanie sumy przestało powtarzać się po każdej stronie tabeli pozycji (pokazuje się teraz raz, po ostatniej pozycji), a tekst w kolumnach „Cena”/„Wartość” przestał się rozjeżdżać przy pięciocyfrowych kwotach.</w:t>
+              <w:t>Dodano opcjonalny komentarz do pozycji z niezerową dopłatą dodatkową w kalkulatorze. Pole komentarza oraz osobny checkbox „Dołącz komentarz do PDF” pojawiają się dopiero po wpisaniu wartości różnej od zera, a treść zapisuje się razem z resztą konfiguracji pozycji (odtwarzana przy edycji, nieusuwana przy chwilowym wyzerowaniu dopłaty). Po zaznaczeniu checkboxa komentarz trafia jako dodatkowy wpis do kolumny „Uwagi” w PDF oferty, we wszystkich miejscach eksportu (kalkulator, Moje oferty, Panel seniora, Panel administratora). Dodano również gatunek jednorazowy — możliwość wyceny gatunku spoza cennika (nazwa + dopłata EUR/t) w obrębie jednej oferty, bez dopisywania go do cennika i bez wpływu na pozostałe oferty. Dodano też opcję odbioru własnego w transporcie — checkbox w panelu „Trasa i transport” ustawia transport na 0 €/t, gdy klient sam odbiera towar spod zakładu. Dodano też harmonogram kwartalny PGL bazowego: administrator planuje ceny na Q1–Q4 wybranego roku osobno dla każdego typu stali, a kalkulator przełącza się na cenę danego kwartału automatycznie z chwilą jego rozpoczęcia. Tabela w panelu administratora pokazuje obok siebie cenę bieżącego miesiąca i wszystkie cztery kwartały. Funkcja wymaga migracji bazy danych (021_create_pgl_quarterly_prices.sql). Poprawiono też zapis ustawień, który przy aktywnej cenie kwartalnej nadpisywał nią ręczną cenę bazową PGL, oraz zaktualizowano dokumentację repozytorium (README, opis „About” na GitHubie, zrzuty ekranu kalkulatora) i numer wersji w nagłówku aplikacji do v1.8. Cały panel kalkulacji zyskał też zwijanie/rozwijanie jednym kliknięciem, analogicznie do panelu Danych Klienta. Ostrzeżenia o PGL poniżej bazy i marży poniżej minimum stały się też wyraźnie widoczne - zamiast drobnego żółtego tekstu pokazują się teraz jako czerwono obramowany, pogrubiony komunikat. Złom w podsumowaniu SSC przestał być stałą kwotą 10 €/t — jest teraz % ceny wsadu (domyślnie 2%), konfigurowalny przez administratora w Ustawieniach. Poprawiono też historię zmian cen bazowych PGL, która nie rejestrowała zmian wprowadzanych przez harmonogram kwartalny (edycję ceny bieżącego kwartału) — teraz trafiają do tego samego logu co ręczne zmiany. Dodano też okres ważności oferty: pola „Ważna od”/„Ważna do” obok przełącznika Arkusz/Krąg. Kwartał wyznaczony z daty „Ważna od” automatycznie dobiera PGL bazowe zaplanowane w harmonogramie kwartalnym dla tego okresu, tą samą logiką co dotychczasowe przełączanie na bieżący kwartał — tylko sparametryzowaną wybranym okresem zamiast „teraz”. Gdy zakres „od”–„do” wykracza poza jeden kwartał, PGL nie jest dobierane automatycznie i pojawia się czerwone ostrzeżenie. Wybrany zakres dat trafia też dodatkowo do stopki PDF oferty, obok dotychczasowej formułki o 48-godzinnej ważności oferty. Kwota złomu w podsumowaniu SSC jest teraz zaokrąglana do liczby całkowitej, na polecenie zarządu. Dodano też termin płatności: osobna para pól „od”/„do” obok okresu ważności oferty, gdzie „do” domyślnie dolicza się jako „od” + termin klienta (konfigurowalny w panelu Klienci, dostępnym też dla starszego handlowca) albo globalny domyślny z Ustawień (domyślnie 7 dni), z możliwością ręcznej zmiany; ustawiony termin trafia też do stopki PDF, zastępując ogólną formułkę o warunkach płatności. Poprawiono też PDF oferty: podsumowanie sumy przestało powtarzać się po każdej stronie tabeli pozycji (pokazuje się teraz raz, po ostatniej pozycji), a tekst w kolumnach „Cena”/„Wartość” przestał się rozjeżdżać przy pięciocyfrowych kwotach. W zestawieniu pozycji doszła możliwość zmiany kolejności wierszy przeciąganiem za uchwyt, z automatycznym przeliczeniem numeracji „Lp.” i płynną animacją przesuwania pozostałych pozycji — nowa kolejność obowiązuje też w PDF, Excelu i zapisanej ofercie; funkcja działa również dotykiem na telefonie i tablecie, nie tylko myszką.</w:t>
             </w:r>
           </w:p>
         </w:tc>
@@ -1454,7 +1454,7 @@
           </w:tcPr>
           <w:p>
             <w:r>
-              <w:t>Zmiana</w:t>
+              <w:t>Nowa funkcja</w:t>
             </w:r>
           </w:p>
         </w:tc>
@@ -1464,7 +1464,7 @@
           </w:tcPr>
           <w:p>
             <w:r>
-              <w:t>(w przygotowaniu)</w:t>
+              <w:t>Zmiana kolejności pozycji w zestawieniu — każdy wiersz zestawienia zyskał uchwyt do przeciągania po lewej stronie, którym handlowiec może przenieść pozycję w inne miejsce listy; numeracja „Lp.” przelicza się automatycznie, a przesuwanie pozostałych wierszy jest płynnie animowane. Nowa kolejność to jednocześnie kolejność pozycji w eksportowanym PDF, w Excelu i w zapisanej ofercie. Funkcja działa też dotykiem na telefonie i tablecie, nie tylko myszką na komputerze.</w:t>
             </w:r>
           </w:p>
         </w:tc>

</xml_diff>

<commit_message>
feat: tons total in zestawienie summary row, aligned under table columns
Total tons now shows next to the value total in the summary footer,
moved into a tfoot row inside the items table so the tons sum lines
up under the Tons column and the value sum lines up under the Value
column, instead of floating in a separate bar below the table.

+ v1.8 report update
</commit_message>
<xml_diff>
--- a/Historia wersji oraz md/Historia wersji/AMSteel_Quote_Raport_Wersji_1.8.docx
+++ b/Historia wersji oraz md/Historia wersji/AMSteel_Quote_Raport_Wersji_1.8.docx
@@ -282,7 +282,7 @@
           </w:tcPr>
           <w:p>
             <w:r>
-              <w:t>Dodano opcjonalny komentarz do pozycji z niezerową dopłatą dodatkową w kalkulatorze. Pole komentarza oraz osobny checkbox „Dołącz komentarz do PDF” pojawiają się dopiero po wpisaniu wartości różnej od zera, a treść zapisuje się razem z resztą konfiguracji pozycji (odtwarzana przy edycji, nieusuwana przy chwilowym wyzerowaniu dopłaty). Po zaznaczeniu checkboxa komentarz trafia jako dodatkowy wpis do kolumny „Uwagi” w PDF oferty, we wszystkich miejscach eksportu (kalkulator, Moje oferty, Panel seniora, Panel administratora). Dodano również gatunek jednorazowy — możliwość wyceny gatunku spoza cennika (nazwa + dopłata EUR/t) w obrębie jednej oferty, bez dopisywania go do cennika i bez wpływu na pozostałe oferty. Dodano też opcję odbioru własnego w transporcie — checkbox w panelu „Trasa i transport” ustawia transport na 0 €/t, gdy klient sam odbiera towar spod zakładu. Dodano też harmonogram kwartalny PGL bazowego: administrator planuje ceny na Q1–Q4 wybranego roku osobno dla każdego typu stali, a kalkulator przełącza się na cenę danego kwartału automatycznie z chwilą jego rozpoczęcia. Tabela w panelu administratora pokazuje obok siebie cenę bieżącego miesiąca i wszystkie cztery kwartały. Funkcja wymaga migracji bazy danych (021_create_pgl_quarterly_prices.sql). Poprawiono też zapis ustawień, który przy aktywnej cenie kwartalnej nadpisywał nią ręczną cenę bazową PGL, oraz zaktualizowano dokumentację repozytorium (README, opis „About” na GitHubie, zrzuty ekranu kalkulatora) i numer wersji w nagłówku aplikacji do v1.8. Cały panel kalkulacji zyskał też zwijanie/rozwijanie jednym kliknięciem, analogicznie do panelu Danych Klienta. Ostrzeżenia o PGL poniżej bazy i marży poniżej minimum stały się też wyraźnie widoczne - zamiast drobnego żółtego tekstu pokazują się teraz jako czerwono obramowany, pogrubiony komunikat. Złom w podsumowaniu SSC przestał być stałą kwotą 10 €/t — jest teraz % ceny wsadu (domyślnie 2%), konfigurowalny przez administratora w Ustawieniach. Poprawiono też historię zmian cen bazowych PGL, która nie rejestrowała zmian wprowadzanych przez harmonogram kwartalny (edycję ceny bieżącego kwartału) — teraz trafiają do tego samego logu co ręczne zmiany. Dodano też okres ważności oferty: pola „Ważna od”/„Ważna do” obok przełącznika Arkusz/Krąg. Kwartał wyznaczony z daty „Ważna od” automatycznie dobiera PGL bazowe zaplanowane w harmonogramie kwartalnym dla tego okresu, tą samą logiką co dotychczasowe przełączanie na bieżący kwartał — tylko sparametryzowaną wybranym okresem zamiast „teraz”. Gdy zakres „od”–„do” wykracza poza jeden kwartał, PGL nie jest dobierane automatycznie i pojawia się czerwone ostrzeżenie. Wybrany zakres dat trafia też dodatkowo do stopki PDF oferty, obok dotychczasowej formułki o 48-godzinnej ważności oferty. Kwota złomu w podsumowaniu SSC jest teraz zaokrąglana do liczby całkowitej, na polecenie zarządu. Dodano też termin płatności: osobna para pól „od”/„do” obok okresu ważności oferty, gdzie „do” domyślnie dolicza się jako „od” + termin klienta (konfigurowalny w panelu Klienci, dostępnym też dla starszego handlowca) albo globalny domyślny z Ustawień (domyślnie 7 dni), z możliwością ręcznej zmiany; ustawiony termin trafia też do stopki PDF, zastępując ogólną formułkę o warunkach płatności. Poprawiono też PDF oferty: podsumowanie sumy przestało powtarzać się po każdej stronie tabeli pozycji (pokazuje się teraz raz, po ostatniej pozycji), a tekst w kolumnach „Cena”/„Wartość” przestał się rozjeżdżać przy pięciocyfrowych kwotach. W zestawieniu pozycji doszła możliwość zmiany kolejności wierszy przeciąganiem za uchwyt, z automatycznym przeliczeniem numeracji „Lp.” i płynną animacją przesuwania pozostałych pozycji — nowa kolejność obowiązuje też w PDF, Excelu i zapisanej ofercie; funkcja działa również dotykiem na telefonie i tablecie, nie tylko myszką.</w:t>
+              <w:t>Dodano opcjonalny komentarz do pozycji z niezerową dopłatą dodatkową w kalkulatorze. Pole komentarza oraz osobny checkbox „Dołącz komentarz do PDF” pojawiają się dopiero po wpisaniu wartości różnej od zera, a treść zapisuje się razem z resztą konfiguracji pozycji (odtwarzana przy edycji, nieusuwana przy chwilowym wyzerowaniu dopłaty). Po zaznaczeniu checkboxa komentarz trafia jako dodatkowy wpis do kolumny „Uwagi” w PDF oferty, we wszystkich miejscach eksportu (kalkulator, Moje oferty, Panel seniora, Panel administratora). Dodano również gatunek jednorazowy — możliwość wyceny gatunku spoza cennika (nazwa + dopłata EUR/t) w obrębie jednej oferty, bez dopisywania go do cennika i bez wpływu na pozostałe oferty. Dodano też opcję odbioru własnego w transporcie — checkbox w panelu „Trasa i transport” ustawia transport na 0 €/t, gdy klient sam odbiera towar spod zakładu. Dodano też harmonogram kwartalny PGL bazowego: administrator planuje ceny na Q1–Q4 wybranego roku osobno dla każdego typu stali, a kalkulator przełącza się na cenę danego kwartału automatycznie z chwilą jego rozpoczęcia. Tabela w panelu administratora pokazuje obok siebie cenę bieżącego miesiąca i wszystkie cztery kwartały. Funkcja wymaga migracji bazy danych (021_create_pgl_quarterly_prices.sql). Poprawiono też zapis ustawień, który przy aktywnej cenie kwartalnej nadpisywał nią ręczną cenę bazową PGL, oraz zaktualizowano dokumentację repozytorium (README, opis „About” na GitHubie, zrzuty ekranu kalkulatora) i numer wersji w nagłówku aplikacji do v1.8. Cały panel kalkulacji zyskał też zwijanie/rozwijanie jednym kliknięciem, analogicznie do panelu Danych Klienta. Ostrzeżenia o PGL poniżej bazy i marży poniżej minimum stały się też wyraźnie widoczne - zamiast drobnego żółtego tekstu pokazują się teraz jako czerwono obramowany, pogrubiony komunikat. Złom w podsumowaniu SSC przestał być stałą kwotą 10 €/t — jest teraz % ceny wsadu (domyślnie 2%), konfigurowalny przez administratora w Ustawieniach. Poprawiono też historię zmian cen bazowych PGL, która nie rejestrowała zmian wprowadzanych przez harmonogram kwartalny (edycję ceny bieżącego kwartału) — teraz trafiają do tego samego logu co ręczne zmiany. Dodano też okres ważności oferty: pola „Ważna od”/„Ważna do” obok przełącznika Arkusz/Krąg. Kwartał wyznaczony z daty „Ważna od” automatycznie dobiera PGL bazowe zaplanowane w harmonogramie kwartalnym dla tego okresu, tą samą logiką co dotychczasowe przełączanie na bieżący kwartał — tylko sparametryzowaną wybranym okresem zamiast „teraz”. Gdy zakres „od”–„do” wykracza poza jeden kwartał, PGL nie jest dobierane automatycznie i pojawia się czerwone ostrzeżenie. Wybrany zakres dat trafia też dodatkowo do stopki PDF oferty, obok dotychczasowej formułki o 48-godzinnej ważności oferty. Kwota złomu w podsumowaniu SSC jest teraz zaokrąglana do liczby całkowitej, na polecenie zarządu. Dodano też termin płatności: osobna para pól „od”/„do” obok okresu ważności oferty, gdzie „do” domyślnie dolicza się jako „od” + termin klienta (konfigurowalny w panelu Klienci, dostępnym też dla starszego handlowca) albo globalny domyślny z Ustawień (domyślnie 7 dni), z możliwością ręcznej zmiany; ustawiony termin trafia też do stopki PDF, zastępując ogólną formułkę o warunkach płatności. Poprawiono też PDF oferty: podsumowanie sumy przestało powtarzać się po każdej stronie tabeli pozycji (pokazuje się teraz raz, po ostatniej pozycji), a tekst w kolumnach „Cena”/„Wartość” przestał się rozjeżdżać przy pięciocyfrowych kwotach. W zestawieniu pozycji doszła możliwość zmiany kolejności wierszy przeciąganiem za uchwyt, z automatycznym przeliczeniem numeracji „Lp.” i płynną animacją przesuwania pozostałych pozycji — nowa kolejność obowiązuje też w PDF, Excelu i zapisanej ofercie; funkcja działa również dotykiem na telefonie i tablecie, nie tylko myszką. Podsumowanie zestawienia pozycji pokazuje teraz również łączną liczbę ton, wyrównaną w wierszu podsumowującym dokładnie pod kolumnami „Tony” i „Wartość” tabeli.</w:t>
             </w:r>
           </w:p>
         </w:tc>
@@ -1469,6 +1469,28 @@
           </w:p>
         </w:tc>
       </w:tr>
+      <w:tr>
+        <w:tc>
+          <w:tcPr>
+            <w:tcW w:w="1963" w:type="dxa"/>
+          </w:tcPr>
+          <w:p>
+            <w:r>
+              <w:t>Nowa funkcja</w:t>
+            </w:r>
+          </w:p>
+        </w:tc>
+        <w:tc>
+          <w:tcPr>
+            <w:tcW w:w="6893" w:type="dxa"/>
+          </w:tcPr>
+          <w:p>
+            <w:r>
+              <w:t>Podsumowanie zestawienia pozycji zyskało widoczny total ilości w tonach — obok dotychczasowej sumy wartości oferty, w tym samym wierszu podsumowującym pod tabelą pozycji. Wiersz podsumowania przeniesiono z osobnego paska pod tabelą do wiersza podsumowującego (tfoot) samej tabeli, dzięki czemu suma ton wyrównuje się dokładnie pod kolumną „Tony”, a suma wartości pod kolumną „Wartość”.</w:t>
+            </w:r>
+          </w:p>
+        </w:tc>
+      </w:tr>
     </w:tbl>
     <w:p>
       <w:pPr>

</xml_diff>

<commit_message>
feat: auto-migrate stale PGL on offer edit/duplicate, with banner
When editing a saved offer (or a freshly duplicated copy) priced in a
past PGL quarter, the calculator now refreshes pglBase, every
zestawienie row's PGL/margin/price, and the validity period to the
current quarter automatically instead of silently keeping stale
numbers. Nothing is written to the DB until the user saves; a
dismissible banner explains what changed and how many rows were
recalculated (rows without a saved inputs snapshot only get PGL
swapped, flagged separately for manual review).

Extracted the steel pricing formula into lib/pricingEngine.ts so the
live calculator and the migration path share one implementation.

Updated the v1.8 changelog docx accordingly.

Co-Authored-By: Claude Sonnet 5 <noreply@anthropic.com>
</commit_message>
<xml_diff>
--- a/Historia wersji oraz md/Historia wersji/AMSteel_Quote_Raport_Wersji_1.8.docx
+++ b/Historia wersji oraz md/Historia wersji/AMSteel_Quote_Raport_Wersji_1.8.docx
@@ -115,7 +115,7 @@
           </w:tcPr>
           <w:p>
             <w:r>
-              <w:t>11.09.2026 - 14.09.2026</w:t>
+              <w:t>11.09.2026 - 15.09.2026</w:t>
             </w:r>
           </w:p>
         </w:tc>
@@ -141,7 +141,7 @@
           </w:tcPr>
           <w:p>
             <w:r>
-              <w:t>14.09.2026</w:t>
+              <w:t>15.09.2026</w:t>
             </w:r>
           </w:p>
         </w:tc>
@@ -262,7 +262,7 @@
           </w:tcPr>
           <w:p>
             <w:r>
-              <w:t>11.09.2026, 14.09.2026</w:t>
+              <w:t>11.09.2026, 14.09.2026, 15.09.2026</w:t>
             </w:r>
           </w:p>
         </w:tc>
@@ -272,7 +272,7 @@
           </w:tcPr>
           <w:p>
             <w:r>
-              <w:t>14.09.2026</w:t>
+              <w:t>15.09.2026</w:t>
             </w:r>
           </w:p>
         </w:tc>
@@ -282,7 +282,7 @@
           </w:tcPr>
           <w:p>
             <w:r>
-              <w:t>Dodano opcjonalny komentarz do pozycji z niezerową dopłatą dodatkową w kalkulatorze. Pole komentarza oraz osobny checkbox „Dołącz komentarz do PDF” pojawiają się dopiero po wpisaniu wartości różnej od zera, a treść zapisuje się razem z resztą konfiguracji pozycji (odtwarzana przy edycji, nieusuwana przy chwilowym wyzerowaniu dopłaty). Po zaznaczeniu checkboxa komentarz trafia jako dodatkowy wpis do kolumny „Uwagi” w PDF oferty, we wszystkich miejscach eksportu (kalkulator, Moje oferty, Panel seniora, Panel administratora). Dodano również gatunek jednorazowy — możliwość wyceny gatunku spoza cennika (nazwa + dopłata EUR/t) w obrębie jednej oferty, bez dopisywania go do cennika i bez wpływu na pozostałe oferty. Dodano też opcję odbioru własnego w transporcie — checkbox w panelu „Trasa i transport” ustawia transport na 0 €/t, gdy klient sam odbiera towar spod zakładu. Dodano też harmonogram kwartalny PGL bazowego: administrator planuje ceny na Q1–Q4 wybranego roku osobno dla każdego typu stali, a kalkulator przełącza się na cenę danego kwartału automatycznie z chwilą jego rozpoczęcia. Tabela w panelu administratora pokazuje obok siebie cenę bieżącego miesiąca i wszystkie cztery kwartały. Funkcja wymaga migracji bazy danych (021_create_pgl_quarterly_prices.sql). Poprawiono też zapis ustawień, który przy aktywnej cenie kwartalnej nadpisywał nią ręczną cenę bazową PGL, oraz zaktualizowano dokumentację repozytorium (README, opis „About” na GitHubie, zrzuty ekranu kalkulatora) i numer wersji w nagłówku aplikacji do v1.8. Cały panel kalkulacji zyskał też zwijanie/rozwijanie jednym kliknięciem, analogicznie do panelu Danych Klienta. Ostrzeżenia o PGL poniżej bazy i marży poniżej minimum stały się też wyraźnie widoczne - zamiast drobnego żółtego tekstu pokazują się teraz jako czerwono obramowany, pogrubiony komunikat. Złom w podsumowaniu SSC przestał być stałą kwotą 10 €/t — jest teraz % ceny wsadu (domyślnie 2%), konfigurowalny przez administratora w Ustawieniach. Poprawiono też historię zmian cen bazowych PGL, która nie rejestrowała zmian wprowadzanych przez harmonogram kwartalny (edycję ceny bieżącego kwartału) — teraz trafiają do tego samego logu co ręczne zmiany. Dodano też okres ważności oferty: pola „Ważna od”/„Ważna do” obok przełącznika Arkusz/Krąg. Kwartał wyznaczony z daty „Ważna od” automatycznie dobiera PGL bazowe zaplanowane w harmonogramie kwartalnym dla tego okresu, tą samą logiką co dotychczasowe przełączanie na bieżący kwartał — tylko sparametryzowaną wybranym okresem zamiast „teraz”. Gdy zakres „od”–„do” wykracza poza jeden kwartał, PGL nie jest dobierane automatycznie i pojawia się czerwone ostrzeżenie. Wybrany zakres dat trafia też dodatkowo do stopki PDF oferty, obok dotychczasowej formułki o 48-godzinnej ważności oferty. Kwota złomu w podsumowaniu SSC jest teraz zaokrąglana do liczby całkowitej, na polecenie zarządu. Dodano też termin płatności: osobna para pól „od”/„do” obok okresu ważności oferty, gdzie „do” domyślnie dolicza się jako „od” + termin klienta (konfigurowalny w panelu Klienci, dostępnym też dla starszego handlowca) albo globalny domyślny z Ustawień (domyślnie 7 dni), z możliwością ręcznej zmiany; ustawiony termin trafia też do stopki PDF, zastępując ogólną formułkę o warunkach płatności. Poprawiono też PDF oferty: podsumowanie sumy przestało powtarzać się po każdej stronie tabeli pozycji (pokazuje się teraz raz, po ostatniej pozycji), a tekst w kolumnach „Cena”/„Wartość” przestał się rozjeżdżać przy pięciocyfrowych kwotach. W zestawieniu pozycji doszła możliwość zmiany kolejności wierszy przeciąganiem za uchwyt, z automatycznym przeliczeniem numeracji „Lp.” i płynną animacją przesuwania pozostałych pozycji — nowa kolejność obowiązuje też w PDF, Excelu i zapisanej ofercie; funkcja działa również dotykiem na telefonie i tablecie, nie tylko myszką. Podsumowanie zestawienia pozycji pokazuje teraz również łączną liczbę ton, wyrównaną w wierszu podsumowującym dokładnie pod kolumnami „Tony” i „Wartość” tabeli.</w:t>
+              <w:t>Dodano opcjonalny komentarz do pozycji z niezerową dopłatą dodatkową w kalkulatorze. Pole komentarza oraz osobny checkbox „Dołącz komentarz do PDF” pojawiają się dopiero po wpisaniu wartości różnej od zera, a treść zapisuje się razem z resztą konfiguracji pozycji (odtwarzana przy edycji, nieusuwana przy chwilowym wyzerowaniu dopłaty). Po zaznaczeniu checkboxa komentarz trafia jako dodatkowy wpis do kolumny „Uwagi” w PDF oferty, we wszystkich miejscach eksportu (kalkulator, Moje oferty, Panel seniora, Panel administratora). Dodano również gatunek jednorazowy — możliwość wyceny gatunku spoza cennika (nazwa + dopłata EUR/t) w obrębie jednej oferty, bez dopisywania go do cennika i bez wpływu na pozostałe oferty. Dodano też opcję odbioru własnego w transporcie — checkbox w panelu „Trasa i transport” ustawia transport na 0 €/t, gdy klient sam odbiera towar spod zakładu. Dodano też harmonogram kwartalny PGL bazowego: administrator planuje ceny na Q1–Q4 wybranego roku osobno dla każdego typu stali, a kalkulator przełącza się na cenę danego kwartału automatycznie z chwilą jego rozpoczęcia. Tabela w panelu administratora pokazuje obok siebie cenę bieżącego miesiąca i wszystkie cztery kwartały. Funkcja wymaga migracji bazy danych (021_create_pgl_quarterly_prices.sql). Poprawiono też zapis ustawień, który przy aktywnej cenie kwartalnej nadpisywał nią ręczną cenę bazową PGL, oraz zaktualizowano dokumentację repozytorium (README, opis „About” na GitHubie, zrzuty ekranu kalkulatora) i numer wersji w nagłówku aplikacji do v1.8. Cały panel kalkulacji zyskał też zwijanie/rozwijanie jednym kliknięciem, analogicznie do panelu Danych Klienta. Ostrzeżenia o PGL poniżej bazy i marży poniżej minimum stały się też wyraźnie widoczne - zamiast drobnego żółtego tekstu pokazują się teraz jako czerwono obramowany, pogrubiony komunikat. Złom w podsumowaniu SSC przestał być stałą kwotą 10 €/t — jest teraz % ceny wsadu (domyślnie 2%), konfigurowalny przez administratora w Ustawieniach. Poprawiono też historię zmian cen bazowych PGL, która nie rejestrowała zmian wprowadzanych przez harmonogram kwartalny (edycję ceny bieżącego kwartału) — teraz trafiają do tego samego logu co ręczne zmiany. Dodano też okres ważności oferty: pola „Ważna od”/„Ważna do” obok przełącznika Arkusz/Krąg. Kwartał wyznaczony z daty „Ważna od” automatycznie dobiera PGL bazowe zaplanowane w harmonogramie kwartalnym dla tego okresu, tą samą logiką co dotychczasowe przełączanie na bieżący kwartał — tylko sparametryzowaną wybranym okresem zamiast „teraz”. Gdy zakres „od”–„do” wykracza poza jeden kwartał, PGL nie jest dobierane automatycznie i pojawia się czerwone ostrzeżenie. Wybrany zakres dat trafia też dodatkowo do stopki PDF oferty, obok dotychczasowej formułki o 48-godzinnej ważności oferty. Kwota złomu w podsumowaniu SSC jest teraz zaokrąglana do liczby całkowitej, na polecenie zarządu. Dodano też termin płatności: osobna para pól „od”/„do” obok okresu ważności oferty, gdzie „do” domyślnie dolicza się jako „od” + termin klienta (konfigurowalny w panelu Klienci, dostępnym też dla starszego handlowca) albo globalny domyślny z Ustawień (domyślnie 7 dni), z możliwością ręcznej zmiany; ustawiony termin trafia też do stopki PDF, zastępując ogólną formułkę o warunkach płatności. Poprawiono też PDF oferty: podsumowanie sumy przestało powtarzać się po każdej stronie tabeli pozycji (pokazuje się teraz raz, po ostatniej pozycji), a tekst w kolumnach „Cena”/„Wartość” przestał się rozjeżdżać przy pięciocyfrowych kwotach. W zestawieniu pozycji doszła możliwość zmiany kolejności wierszy przeciąganiem za uchwyt, z automatycznym przeliczeniem numeracji „Lp.” i płynną animacją przesuwania pozostałych pozycji — nowa kolejność obowiązuje też w PDF, Excelu i zapisanej ofercie; funkcja działa również dotykiem na telefonie i tablecie, nie tylko myszką. Podsumowanie zestawienia pozycji pokazuje teraz również łączną liczbę ton, wyrównaną w wierszu podsumowującym dokładnie pod kolumnami „Tony” i „Wartość” tabeli. Dodano też migrację przeterminowanego PGL: otwarcie do edycji zapisanej oferty (albo świeżo zduplikowanej kopii) wycenionej w innym kwartale niż bieżący automatycznie aktualizuje PGL bazowe, PGL/marżę/cenę każdej pozycji zestawienia oraz okres ważności do dzisiejszej daty, z wyraźnym banerem informującym o zmianie i liczbie przeliczonych pozycji; nic nie zapisuje się do bazy bez ręcznego zapisania oferty.</w:t>
             </w:r>
           </w:p>
         </w:tc>
@@ -1206,7 +1206,7 @@
           </w:tcPr>
           <w:p>
             <w:r>
-              <w:t>Zmiana</w:t>
+              <w:t>Nowa funkcja</w:t>
             </w:r>
           </w:p>
         </w:tc>
@@ -1216,7 +1216,7 @@
           </w:tcPr>
           <w:p>
             <w:r>
-              <w:t>(w przygotowaniu)</w:t>
+              <w:t>Migracja przeterminowanego PGL przy edycji i duplikowaniu oferty — gdy zapisana oferta była wyceniona w innym kwartale niż bieżący (harmonogram kwartalny PGL, patrz wyżej), otwarcie jej do edycji albo do edycji świeżo zduplikowanej kopii automatycznie podmienia PGL bazowe oraz PGL i przeliczoną marżę/cenę/wartość każdej pozycji zestawienia na aktualne dla bieżącego kwartału (dla każdego typu stali osobno), a okres ważności „Ważna od”/„Ważna do” przesuwa na dzisiejszą datę z zachowaniem oryginalnej długości zakresu. Zmiana nie blokuje edycji i nie zapisuje się automatycznie — handlowiec widzi wyraźny baner z informacją, na jaki kwartał oferta była pierwotnie wyceniona i ile pozycji zostało przeliczonych, a dane trafiają do bazy dopiero po ręcznym zapisaniu (tworząc, jak zwykle, nową wersję oferty). Pozycje sprzed wprowadzenia pełnej konfiguracji dopłat (starsze oferty bez zapisanego „inputs”) dostają wyłącznie podmienione PGL bez przeliczenia marży i ceny — baner osobno informuje, ile takich pozycji wymaga ręcznego sprawdzenia. Duplikowanie samo w sobie nadal tylko kopiuje ofertę; migracja uruchamia się dopiero przy otwarciu takiej kopii do edycji, tą samą ścieżką co zwykła edycja. Funkcja nie wymaga migracji bazy danych.</w:t>
             </w:r>
           </w:p>
         </w:tc>
@@ -1542,7 +1542,7 @@
         <w:pStyle w:val="Listapunktowana"/>
       </w:pPr>
       <w:r>
-        <w:t>Funkcje wersji 1.8 (komentarz do dopłaty dodatkowej, gatunek jednorazowy, odbiór własny w transporcie oraz harmonogram kwartalny PGL) są gotowe i przetestowane lokalnie, ale nie zostały jeszcze wdrożone na środowisko produkcyjne; trzy pierwsze nie wymagają migracji bazy danych (dane trafiają do istniejącego pola JSONB „offer_data”), natomiast harmonogram kwartalny PGL wymaga uruchomienia migracji 021_create_pgl_quarterly_prices.sql przed podmianą plików aplikacji.</w:t>
+        <w:t>Funkcje wersji 1.8 (komentarz do dopłaty dodatkowej, gatunek jednorazowy, odbiór własny w transporcie, harmonogram kwartalny PGL oraz migracja przeterminowanego PGL przy edycji/duplikowaniu oferty) są gotowe i przetestowane lokalnie, ale nie zostały jeszcze wdrożone na środowisko produkcyjne; wszystkie poza harmonogramem kwartalnym PGL nie wymagają migracji bazy danych (dane trafiają do istniejącego pola JSONB „offer_data”), natomiast harmonogram kwartalny PGL wymaga uruchomienia migracji 021_create_pgl_quarterly_prices.sql przed podmianą plików aplikacji.</w:t>
       </w:r>
     </w:p>
     <w:p>
@@ -1563,7 +1563,7 @@
         <w:pStyle w:val="Listapunktowana"/>
       </w:pPr>
       <w:r>
-        <w:t>Wdrożenie wersji 1.8 (komentarz do dopłaty dodatkowej, gatunek jednorazowy, odbiór własny w transporcie, harmonogram kwartalny PGL) na środowisko produkcyjne — wraz z migracją 021_create_pgl_quarterly_prices.sql</w:t>
+        <w:t>Wdrożenie wersji 1.8 (komentarz do dopłaty dodatkowej, gatunek jednorazowy, odbiór własny w transporcie, harmonogram kwartalny PGL, migracja przeterminowanego PGL przy edycji/duplikowaniu oferty) na środowisko produkcyjne — wraz z migracją 021_create_pgl_quarterly_prices.sql</w:t>
       </w:r>
     </w:p>
     <w:p>

</xml_diff>

<commit_message>
docs: replace em dashes with regular hyphens in v1.8 report
Co-Authored-By: Claude Sonnet 5 <noreply@anthropic.com>
</commit_message>
<xml_diff>
--- a/Historia wersji oraz md/Historia wersji/AMSteel_Quote_Raport_Wersji_1.8.docx
+++ b/Historia wersji oraz md/Historia wersji/AMSteel_Quote_Raport_Wersji_1.8.docx
@@ -115,7 +115,13 @@
           </w:tcPr>
           <w:p>
             <w:r>
-              <w:t>11.09.2026 - 15.09.2026</w:t>
+              <w:t>11.09.2026 - 1</w:t>
+            </w:r>
+            <w:r>
+              <w:t>9</w:t>
+            </w:r>
+            <w:r>
+              <w:t>.09.2026</w:t>
             </w:r>
           </w:p>
         </w:tc>
@@ -141,7 +147,13 @@
           </w:tcPr>
           <w:p>
             <w:r>
-              <w:t>15.09.2026</w:t>
+              <w:t>1</w:t>
+            </w:r>
+            <w:r>
+              <w:t>9</w:t>
+            </w:r>
+            <w:r>
+              <w:t>.09.2026</w:t>
             </w:r>
           </w:p>
         </w:tc>
@@ -178,10 +190,10 @@
         <w:tblLook w:val="04A0" w:firstRow="1" w:lastRow="0" w:firstColumn="1" w:lastColumn="0" w:noHBand="0" w:noVBand="1"/>
       </w:tblPr>
       <w:tblGrid>
-        <w:gridCol w:w="1226"/>
-        <w:gridCol w:w="2481"/>
-        <w:gridCol w:w="1568"/>
-        <w:gridCol w:w="3581"/>
+        <w:gridCol w:w="1208"/>
+        <w:gridCol w:w="2420"/>
+        <w:gridCol w:w="1550"/>
+        <w:gridCol w:w="3678"/>
       </w:tblGrid>
       <w:tr>
         <w:tc>
@@ -264,6 +276,9 @@
             <w:r>
               <w:t>11.09.2026, 14.09.2026, 15.09.2026</w:t>
             </w:r>
+            <w:r>
+              <w:t>, 16.09.2026, 19.09.2026</w:t>
+            </w:r>
           </w:p>
         </w:tc>
         <w:tc>
@@ -272,7 +287,13 @@
           </w:tcPr>
           <w:p>
             <w:r>
-              <w:t>15.09.2026</w:t>
+              <w:t>1</w:t>
+            </w:r>
+            <w:r>
+              <w:t>9</w:t>
+            </w:r>
+            <w:r>
+              <w:t>.09.2026</w:t>
             </w:r>
           </w:p>
         </w:tc>
@@ -282,7 +303,19 @@
           </w:tcPr>
           <w:p>
             <w:r>
-              <w:t>Dodano opcjonalny komentarz do pozycji z niezerową dopłatą dodatkową w kalkulatorze. Pole komentarza oraz osobny checkbox „Dołącz komentarz do PDF” pojawiają się dopiero po wpisaniu wartości różnej od zera, a treść zapisuje się razem z resztą konfiguracji pozycji (odtwarzana przy edycji, nieusuwana przy chwilowym wyzerowaniu dopłaty). Po zaznaczeniu checkboxa komentarz trafia jako dodatkowy wpis do kolumny „Uwagi” w PDF oferty, we wszystkich miejscach eksportu (kalkulator, Moje oferty, Panel seniora, Panel administratora). Dodano również gatunek jednorazowy — możliwość wyceny gatunku spoza cennika (nazwa + dopłata EUR/t) w obrębie jednej oferty, bez dopisywania go do cennika i bez wpływu na pozostałe oferty. Dodano też opcję odbioru własnego w transporcie — checkbox w panelu „Trasa i transport” ustawia transport na 0 €/t, gdy klient sam odbiera towar spod zakładu. Dodano też harmonogram kwartalny PGL bazowego: administrator planuje ceny na Q1–Q4 wybranego roku osobno dla każdego typu stali, a kalkulator przełącza się na cenę danego kwartału automatycznie z chwilą jego rozpoczęcia. Tabela w panelu administratora pokazuje obok siebie cenę bieżącego miesiąca i wszystkie cztery kwartały. Funkcja wymaga migracji bazy danych (021_create_pgl_quarterly_prices.sql). Poprawiono też zapis ustawień, który przy aktywnej cenie kwartalnej nadpisywał nią ręczną cenę bazową PGL, oraz zaktualizowano dokumentację repozytorium (README, opis „About” na GitHubie, zrzuty ekranu kalkulatora) i numer wersji w nagłówku aplikacji do v1.8. Cały panel kalkulacji zyskał też zwijanie/rozwijanie jednym kliknięciem, analogicznie do panelu Danych Klienta. Ostrzeżenia o PGL poniżej bazy i marży poniżej minimum stały się też wyraźnie widoczne - zamiast drobnego żółtego tekstu pokazują się teraz jako czerwono obramowany, pogrubiony komunikat. Złom w podsumowaniu SSC przestał być stałą kwotą 10 €/t — jest teraz % ceny wsadu (domyślnie 2%), konfigurowalny przez administratora w Ustawieniach. Poprawiono też historię zmian cen bazowych PGL, która nie rejestrowała zmian wprowadzanych przez harmonogram kwartalny (edycję ceny bieżącego kwartału) — teraz trafiają do tego samego logu co ręczne zmiany. Dodano też okres ważności oferty: pola „Ważna od”/„Ważna do” obok przełącznika Arkusz/Krąg. Kwartał wyznaczony z daty „Ważna od” automatycznie dobiera PGL bazowe zaplanowane w harmonogramie kwartalnym dla tego okresu, tą samą logiką co dotychczasowe przełączanie na bieżący kwartał — tylko sparametryzowaną wybranym okresem zamiast „teraz”. Gdy zakres „od”–„do” wykracza poza jeden kwartał, PGL nie jest dobierane automatycznie i pojawia się czerwone ostrzeżenie. Wybrany zakres dat trafia też dodatkowo do stopki PDF oferty, obok dotychczasowej formułki o 48-godzinnej ważności oferty. Kwota złomu w podsumowaniu SSC jest teraz zaokrąglana do liczby całkowitej, na polecenie zarządu. Dodano też termin płatności: osobna para pól „od”/„do” obok okresu ważności oferty, gdzie „do” domyślnie dolicza się jako „od” + termin klienta (konfigurowalny w panelu Klienci, dostępnym też dla starszego handlowca) albo globalny domyślny z Ustawień (domyślnie 7 dni), z możliwością ręcznej zmiany; ustawiony termin trafia też do stopki PDF, zastępując ogólną formułkę o warunkach płatności. Poprawiono też PDF oferty: podsumowanie sumy przestało powtarzać się po każdej stronie tabeli pozycji (pokazuje się teraz raz, po ostatniej pozycji), a tekst w kolumnach „Cena”/„Wartość” przestał się rozjeżdżać przy pięciocyfrowych kwotach. W zestawieniu pozycji doszła możliwość zmiany kolejności wierszy przeciąganiem za uchwyt, z automatycznym przeliczeniem numeracji „Lp.” i płynną animacją przesuwania pozostałych pozycji — nowa kolejność obowiązuje też w PDF, Excelu i zapisanej ofercie; funkcja działa również dotykiem na telefonie i tablecie, nie tylko myszką. Podsumowanie zestawienia pozycji pokazuje teraz również łączną liczbę ton, wyrównaną w wierszu podsumowującym dokładnie pod kolumnami „Tony” i „Wartość” tabeli. Dodano też migrację przeterminowanego PGL: otwarcie do edycji zapisanej oferty (albo świeżo zduplikowanej kopii) wycenionej w innym kwartale niż bieżący automatycznie aktualizuje PGL bazowe, PGL/marżę/cenę każdej pozycji zestawienia oraz okres ważności do dzisiejszej daty, z wyraźnym banerem informującym o zmianie i liczbie przeliczonych pozycji; nic nie zapisuje się do bazy bez ręcznego zapisania oferty.</w:t>
+              <w:t xml:space="preserve">Dodano opcjonalny komentarz do pozycji z niezerową dopłatą dodatkową w kalkulatorze. Pole komentarza oraz osobny checkbox „Dołącz komentarz do PDF” pojawiają się dopiero po wpisaniu wartości różnej od zera, a treść zapisuje się razem z resztą konfiguracji pozycji (odtwarzana przy edycji, nieusuwana przy chwilowym wyzerowaniu dopłaty). Po zaznaczeniu checkboxa komentarz trafia jako dodatkowy wpis do kolumny „Uwagi” w PDF oferty, we wszystkich miejscach eksportu (kalkulator, Moje oferty, Panel seniora, Panel administratora). Dodano również gatunek jednorazowy - możliwość wyceny gatunku spoza cennika (nazwa + dopłata EUR/t) w obrębie jednej oferty, bez dopisywania go do cennika i bez wpływu na pozostałe oferty. Dodano też opcję odbioru własnego w transporcie - checkbox w panelu „Trasa i transport” ustawia transport na 0 €/t, gdy klient sam odbiera towar spod zakładu. Dodano też </w:t>
+            </w:r>
+            <w:r>
+              <w:lastRenderedPageBreak/>
+              <w:t xml:space="preserve">harmonogram kwartalny PGL bazowego: administrator planuje ceny na Q1–Q4 wybranego roku osobno dla każdego typu stali, a kalkulator przełącza się na cenę danego kwartału automatycznie z chwilą jego rozpoczęcia. Tabela w panelu administratora pokazuje obok siebie cenę bieżącego miesiąca i wszystkie cztery kwartały. Funkcja wymaga migracji bazy danych (021_create_pgl_quarterly_prices.sql). Poprawiono też zapis ustawień, który przy aktywnej cenie kwartalnej nadpisywał nią ręczną cenę bazową PGL, oraz zaktualizowano dokumentację repozytorium (README, opis „About” na GitHubie, zrzuty ekranu kalkulatora) i numer wersji w nagłówku aplikacji do v1.8. Cały panel kalkulacji zyskał też zwijanie/rozwijanie jednym kliknięciem, analogicznie do panelu Danych Klienta. Ostrzeżenia o PGL poniżej bazy i marży poniżej minimum stały się też wyraźnie widoczne - zamiast drobnego żółtego tekstu pokazują się teraz jako czerwono obramowany, pogrubiony komunikat. Złom w podsumowaniu SSC przestał być stałą kwotą 10 €/t - jest teraz % ceny wsadu (domyślnie 2%), konfigurowalny przez administratora w Ustawieniach. Poprawiono też historię zmian cen bazowych PGL, która nie rejestrowała zmian wprowadzanych przez harmonogram kwartalny (edycję ceny bieżącego kwartału) - teraz trafiają do tego samego logu co ręczne zmiany. Dodano też okres ważności oferty: pola „Ważna od”/„Ważna do” obok przełącznika Arkusz/Krąg. Kwartał wyznaczony z daty „Ważna od” automatycznie dobiera PGL bazowe zaplanowane w harmonogramie kwartalnym dla tego okresu, tą samą logiką co dotychczasowe przełączanie </w:t>
+            </w:r>
+            <w:r>
+              <w:lastRenderedPageBreak/>
+              <w:t xml:space="preserve">na bieżący kwartał - tylko sparametryzowaną wybranym okresem zamiast „teraz”. Gdy zakres „od”–„do” wykracza poza jeden kwartał, PGL nie jest dobierane automatycznie i pojawia się czerwone ostrzeżenie. Wybrany zakres dat trafia też dodatkowo do stopki PDF oferty, obok dotychczasowej formułki o 48-godzinnej ważności oferty. Kwota złomu w podsumowaniu SSC jest teraz zaokrąglana do liczby całkowitej, na polecenie zarządu. Dodano też termin płatności: osobna para pól „od”/„do” obok okresu ważności oferty, gdzie „do” domyślnie dolicza się jako „od” + termin klienta (konfigurowalny w panelu Klienci, dostępnym też dla starszego handlowca) albo globalny domyślny z Ustawień (domyślnie 7 dni), z możliwością ręcznej zmiany; ustawiony termin trafia też do stopki PDF, zastępując ogólną formułkę o warunkach płatności. Poprawiono też PDF oferty: podsumowanie sumy przestało powtarzać się po każdej stronie tabeli pozycji (pokazuje się teraz raz, po ostatniej pozycji), a tekst w kolumnach „Cena”/„Wartość” przestał się rozjeżdżać przy pięciocyfrowych kwotach. W zestawieniu pozycji doszła możliwość zmiany kolejności wierszy przeciąganiem za uchwyt, z automatycznym przeliczeniem numeracji „Lp.” i płynną animacją przesuwania pozostałych pozycji - nowa kolejność obowiązuje też w PDF, Excelu i zapisanej ofercie; funkcja działa również dotykiem na telefonie i tablecie, nie tylko myszką. Podsumowanie zestawienia pozycji pokazuje teraz również łączną liczbę ton, wyrównaną w wierszu podsumowującym dokładnie pod kolumnami „Tony” i „Wartość” tabeli. Dodano też migrację przeterminowanego PGL: otwarcie do </w:t>
+            </w:r>
+            <w:r>
+              <w:lastRenderedPageBreak/>
+              <w:t>edycji zapisanej oferty (albo świeżo zduplikowanej kopii) wycenionej w innym kwartale niż bieżący automatycznie aktualizuje PGL bazowe, PGL/marżę/cenę każdej pozycji zestawienia oraz okres ważności do dzisiejszej daty, z wyraźnym banerem informującym o zmianie i liczbie przeliczonych pozycji; nic nie zapisuje się do bazy bez ręcznego zapisania oferty.</w:t>
             </w:r>
           </w:p>
         </w:tc>
@@ -294,6 +327,7 @@
           </w:tcPr>
           <w:p>
             <w:r>
+              <w:lastRenderedPageBreak/>
               <w:t>1.7</w:t>
             </w:r>
           </w:p>
@@ -324,7 +358,11 @@
           </w:tcPr>
           <w:p>
             <w:r>
-              <w:t>Naprawiono błąd zapisu decyzji klienta (wygrana / przegrana) na ofercie wysłanej - konflikt typów parametru w zapytaniu SQL (kod 42P08); wcześniej funkcja nie zapisywała żadnej decyzji. Zablokowano wysyłkę oferty do klienta bez danych firmy klienta (nazwa firmy i NIP) - tworzenie i zapis oferty bez tych danych nadal działają. Senior może zbudować zespół z juniorów (sekcja „Mój zespół” w panelu seniora i administratora), a panel „Analiza” pokazuje mu wtedy dane własne oraz całego zespołu, z możliwością zawężenia do siebie lub wybranego juniora. Eksport ofert, panelu „Analiza” i historii PGL do Excela otwiera się teraz z kolumnami dopasowanymi do zawartości, bez ręcznego rozciągania. Dodano automatyczne liczenie transportu z trasy dostawy: rzeczywista odległość drogowa do klienta, cennik przewoźnika w pasmach kilometrowych, przeliczanie na kursy według ładowności 21 t i dopłaty za elementy ponadwymiarowe, wraz z edytowalnym cennikiem w panelu administratora. Wysoki kontrast (jasny i ciemny) przeszedł na nowoczesną paletę kolorów wspólną ze zwykłym motywem – zamiast czerni-na-bieli tryb ten daje teraz większą czcionkę, powiększony widok i grubsze obramowania przy firmowych kolorach. Naprawiono też fałszywe ostrzeżenie o niezapisanych zmianach po rozpoczęciu nowej oferty w trakcie edycji zapisanej – pojawiało się mimo pustego, niezmienionego formularza. Blacha łezkowa otrzymała dopłatę wymiarową zależną od szerokości (30 €/t do 1,5 m, 45 €/t powyżej) oraz własną tabelę gatunków z domyślnym S235JR+N. Wersja 1.7 została wdrożona na środowisko produkcyjne 10.09.2026 wraz z migracjami 019 (zespoły seniora, tabela „team_members”) i 020 (cennik transportowy, tabele „transport_tariff_bands” i „route_cache”); wdrożenie zakończone powodzeniem.</w:t>
+              <w:t xml:space="preserve">Naprawiono błąd zapisu decyzji klienta (wygrana / przegrana) na ofercie wysłanej - konflikt typów parametru w zapytaniu SQL (kod 42P08); wcześniej funkcja nie zapisywała żadnej decyzji. Zablokowano wysyłkę oferty do klienta bez danych firmy klienta (nazwa firmy i NIP) - tworzenie i zapis oferty bez tych danych nadal działają. Senior może zbudować zespół z juniorów (sekcja „Mój zespół” w panelu seniora i administratora), a panel „Analiza” pokazuje mu wtedy dane własne oraz całego zespołu, z możliwością zawężenia do siebie lub wybranego juniora. Eksport ofert, panelu „Analiza” i historii PGL do Excela otwiera się teraz z kolumnami dopasowanymi do zawartości, bez ręcznego rozciągania. Dodano automatyczne liczenie transportu z trasy dostawy: rzeczywista odległość drogowa do klienta, cennik przewoźnika w pasmach kilometrowych, przeliczanie na kursy według ładowności 21 t i dopłaty za elementy ponadwymiarowe, wraz z edytowalnym cennikiem w panelu administratora. Wysoki kontrast (jasny i ciemny) przeszedł na nowoczesną paletę kolorów wspólną ze zwykłym motywem – zamiast czerni-na-bieli tryb ten daje teraz większą czcionkę, powiększony widok i grubsze obramowania przy firmowych kolorach. Naprawiono też fałszywe </w:t>
+            </w:r>
+            <w:r>
+              <w:lastRenderedPageBreak/>
+              <w:t>ostrzeżenie o niezapisanych zmianach po rozpoczęciu nowej oferty w trakcie edycji zapisanej – pojawiało się mimo pustego, niezmienionego formularza. Blacha łezkowa otrzymała dopłatę wymiarową zależną od szerokości (30 €/t do 1,5 m, 45 €/t powyżej) oraz własną tabelę gatunków z domyślnym S235JR+N. Wersja 1.7 została wdrożona na środowisko produkcyjne 10.09.2026 wraz z migracjami 019 (zespoły seniora, tabela „team_members”) i 020 (cennik transportowy, tabele „transport_tariff_bands” i „route_cache”); wdrożenie zakończone powodzeniem.</w:t>
             </w:r>
           </w:p>
         </w:tc>
@@ -367,9 +405,15 @@
           </w:tcPr>
           <w:p>
             <w:r>
-              <w:t xml:space="preserve">Uzupełniono tabelę gatunków PICKLED (HRS Trawiona) o brakujący zakres SAPH 440 -&gt; DD12 wraz z dodatkowymi gatunkami (K367-DD14+B, FE 600 DP, S300EK, P265GH, P275SL, P355NL2, SA516G60-LOWSI, S240 D), na podstawie danych przekazanych przez klienta. Poprawiono czytelność etykiet wersjonowania na liście ofert (numer oferty offer_id/offer_id.N zamieniony miejscami z nazwą oferty jako główny nagłówek wiersza, wyraźniejsza etykieta „poprzednia wersja”). Przycisk „Aktualizuj pozycję” w kalkulatorze zmienia teraz kolor na niebieski podczas edycji istniejącej pozycji, aby odróżnić go od żółtego przycisku dodawania nowej pozycji. Kliknięcie pozycji na liście zestawienia (wiersz lub ołówek) przewija teraz widok automatycznie do góry kalkulatora. Cena bazowa PGL jest od teraz zawsze w EUR (€/t), niezależnie od waluty oferty. Podczas edycji zapisanej oferty w kalkulatorze pojawia się teraz wyraźny baner „Teraz edytujesz ofertę: offer_id”, tak by nie pomylić jej z tworzeniem nowej wyceny; baner pokazuje właściwy numer wersji (np. offer_27.1), nie surowe wewnętrzne ID wiersza w bazie. Tryb wysokiego kontrastu doczekał się osobnych wariantów jasnego i ciemnego (wcześniej był to jeden, stały motyw ignorujący przełącznik jasny/ciemny) - przełączanie między jasnym a ciemnym motywem działa teraz poprawnie również przy włączonym wysokim kontraście, a wyłączenie wysokiego kontrastu przywraca wcześniej wybrany motyw jasny lub ciemny. Poprawiono też kilka miejsc w interfejsie (pasek „Suma Huta”, </w:t>
+              <w:t xml:space="preserve">Uzupełniono tabelę gatunków PICKLED (HRS Trawiona) o brakujący zakres SAPH 440 -&gt; DD12 wraz z dodatkowymi gatunkami (K367-DD14+B, FE 600 DP, S300EK, P265GH, P275SL, P355NL2, SA516G60-LOWSI, S240 D), na podstawie danych przekazanych przez klienta. Poprawiono czytelność etykiet wersjonowania na liście ofert (numer oferty offer_id/offer_id.N zamieniony miejscami z nazwą oferty jako główny nagłówek wiersza, wyraźniejsza etykieta „poprzednia wersja”). Przycisk „Aktualizuj pozycję” w kalkulatorze zmienia teraz kolor na niebieski podczas edycji istniejącej pozycji, aby odróżnić go od żółtego przycisku dodawania nowej pozycji. Kliknięcie pozycji na liście zestawienia (wiersz lub ołówek) przewija teraz widok automatycznie do góry kalkulatora. Cena bazowa PGL jest od teraz zawsze w EUR (€/t), niezależnie od waluty oferty. Podczas edycji zapisanej oferty w kalkulatorze pojawia się teraz wyraźny baner „Teraz edytujesz ofertę: offer_id”, tak by nie pomylić jej z tworzeniem nowej wyceny; baner pokazuje właściwy numer wersji (np. offer_27.1), nie </w:t>
+            </w:r>
+            <w:r>
               <w:lastRenderedPageBreak/>
-              <w:t>przyciski przełączające, podpowiedzi gatunków, komunikaty ostrzegawcze), w których kolory tła i tekstu były zapisane na sztywno pod jasny wysoki kontrast i stawały się nieczytelne w wariancie ciemnym. Panel administratora zyskał filtrowanie i sortowanie historii zmian cen bazowych PGL (po typie stali, zakresie dat i dowolnej kolumnie tabeli) wraz z przyciskiem czyszczącym filtry; eksport do Excela odzwierciedla teraz aktualnie wybrany widok, a nie zawsze całą historię. Generowanie oferty PDF respektuje teraz język interfejsu wybrany przez handlowca (PL/EN/CS/DE) - wcześniej cały szablon PDF (nagłówki tabeli, etykiety danych klienta, uwagi prawne w stopce, podpisy) był na sztywno po polsku, niezależnie od języka ustawionego w aplikacji. Na liście „Moje oferty” naprawiono kliknięcie w rozwiniętej historii wersji ofert, które błędnie otwierało do edycji zawsze najnowszą wersję zamiast tej faktycznie klikniętej. W tej samej wersji dodano panel „Analiza” dla wszystkich ról (tonaż zaoferowany, wygrany i przegrany, wskaźnik skuteczności, rozbicie w czasie oraz według typu stali i klienta, tabela ofert z eksportem; zakres danych ustalany po stronie serwera - junior i senior widzą własne oferty, administrator całą firmę) wraz z nową osią „decyzja klienta” na ofercie wysłanej („wygrana” / „przegrana” / „oczekująca”, migracja 018), niezależną od statusu obiegu oferty.</w:t>
+              <w:t xml:space="preserve">surowe wewnętrzne ID wiersza w bazie. Tryb wysokiego kontrastu doczekał się osobnych wariantów jasnego i ciemnego (wcześniej był to jeden, stały motyw ignorujący przełącznik jasny/ciemny) - przełączanie między jasnym a ciemnym motywem działa teraz poprawnie również przy włączonym wysokim kontraście, a wyłączenie wysokiego kontrastu przywraca wcześniej wybrany motyw jasny lub ciemny. Poprawiono też kilka miejsc w interfejsie (pasek „Suma Huta”, przyciski przełączające, podpowiedzi gatunków, komunikaty ostrzegawcze), w których kolory tła i tekstu były zapisane na sztywno pod jasny wysoki kontrast i stawały się nieczytelne w wariancie ciemnym. Panel administratora zyskał filtrowanie i sortowanie historii zmian cen bazowych PGL (po typie stali, zakresie dat i dowolnej kolumnie tabeli) wraz z przyciskiem czyszczącym filtry; eksport do Excela odzwierciedla teraz aktualnie wybrany widok, a nie zawsze całą historię. Generowanie oferty PDF respektuje teraz język interfejsu wybrany przez handlowca (PL/EN/CS/DE) - wcześniej cały szablon PDF (nagłówki tabeli, etykiety danych klienta, uwagi prawne w stopce, podpisy) był na sztywno po polsku, niezależnie od języka ustawionego w aplikacji. Na liście „Moje oferty” naprawiono kliknięcie w rozwiniętej historii wersji ofert, które błędnie otwierało do edycji zawsze najnowszą wersję zamiast tej faktycznie klikniętej. W tej samej wersji dodano panel „Analiza” dla wszystkich ról (tonaż zaoferowany, wygrany i przegrany, wskaźnik skuteczności, rozbicie w czasie oraz według typu stali i klienta, tabela ofert z eksportem; zakres danych ustalany po stronie serwera - junior i senior widzą </w:t>
+            </w:r>
+            <w:r>
+              <w:lastRenderedPageBreak/>
+              <w:t>własne oferty, administrator całą firmę) wraz z nową osią „decyzja klienta” na ofercie wysłanej („wygrana” / „przegrana” / „oczekująca”, migracja 018), niezależną od statusu obiegu oferty.</w:t>
             </w:r>
           </w:p>
         </w:tc>
@@ -412,11 +456,11 @@
           </w:tcPr>
           <w:p>
             <w:r>
-              <w:t xml:space="preserve">Naprawiono brak synchronizacji kontaktu głównego wpisywanego w panelu „Klienci” z tabelą osób kontaktowych - dane osoby zapisane przy edycji firmy nie pojawiały się w zakładce „Kontakty”. Panel „Klienci” </w:t>
+              <w:t xml:space="preserve">Naprawiono brak synchronizacji kontaktu głównego wpisywanego w panelu „Klienci” z tabelą osób kontaktowych - dane osoby zapisane przy edycji firmy nie pojawiały się w zakładce „Kontakty”. Panel „Klienci” zyskał akcję „Kontakty” przy każdej firmie: rozwija listę zapisanych dla niej osób z możliwością edycji i usunięcia każdej z osobna oraz formularzem dodania kolejnej, bez przechodzenia do osobnej zakładki. Dodano migrację uzupełniającą kontakty zapisane, zanim ta poprawka weszła w życie. Dodano tryb „Wysoki kontrast” (przycisk obok Jasny/Ciemny, dostępny na wszystkich podstronach). W tym samym okresie dodano historię zmian cen bazowych PGL z eksportem do Excela, kolorowe oznaczenia typów stali HRS/CR/HDG w panelu ustawień oraz klikalne kafelki statusów na pulpicie administratora, a w kalkulatorze kliknięcie wiersza pozycji otwiera ją do edycji. Kolumna „Uwagi” w PDF oferty pokazuje teraz pełny zestaw wybranych dopłat dla każdej pozycji. Panel ustawień administratora zyskał próg „Minimalna marża (%)” - junior może odtąd wysłać ofertę do klienta bezpośrednio z szkicu, bez zatwierdzenia seniora/administratora, jeśli każda pozycja ma marżę i PGL bazowe w normie; w przeciwnym razie oferta nadal wymaga pełnej ścieżki zatwierdzenia. Kliknięcie w ofertę na liście (Moje oferty, Panel seniora, Panel administratora) otwiera ją teraz do edycji, tak jak pozycje w kalkulatorze. Edycja już zapisanej oferty nie nadpisuje jej w miejscu - zapisuje nową wersję („offer_30.1”, </w:t>
+            </w:r>
+            <w:r>
               <w:lastRenderedPageBreak/>
-              <w:t xml:space="preserve">zyskał akcję „Kontakty” przy każdej firmie: rozwija listę zapisanych dla niej osób z możliwością edycji i usunięcia każdej z osobna oraz formularzem dodania kolejnej, bez przechodzenia do osobnej zakładki. Dodano migrację uzupełniającą kontakty zapisane, zanim ta poprawka weszła w życie. Dodano tryb „Wysoki kontrast” (przycisk obok Jasny/Ciemny, dostępny na wszystkich podstronach). W tym samym okresie dodano historię zmian cen bazowych PGL z eksportem do Excela, kolorowe oznaczenia typów stali HRS/CR/HDG w panelu ustawień oraz klikalne kafelki statusów na pulpicie administratora, a w kalkulatorze kliknięcie wiersza pozycji otwiera ją do edycji. Kolumna „Uwagi” w PDF oferty pokazuje teraz pełny zestaw wybranych dopłat dla każdej pozycji. Panel ustawień administratora zyskał próg „Minimalna marża (%)” - junior może odtąd wysłać ofertę do klienta bezpośrednio z szkicu, bez zatwierdzenia seniora/administratora, jeśli każda pozycja ma marżę i PGL bazowe w normie; w przeciwnym razie oferta nadal wymaga pełnej ścieżki zatwierdzenia. Kliknięcie w ofertę na liście (Moje oferty, Panel seniora, Panel administratora) otwiera ją teraz do edycji, tak jak pozycje w kalkulatorze. Edycja już zapisanej oferty nie nadpisuje jej w miejscu - zapisuje nową wersję („offer_30.1”, „offer_30.2”...), a poprzednie wersje zostają widoczne pod rozwijaną listą na tej samej karcie. W tym samym okresie dodano trzy nowe typy stali obok HRS/CR/HDG: PICKLED (HRS Trawiona), TEARDROP (Blacha łezkowa) i ZM (Magnelis) - wraz z własnymi tabelami gatunków, matrycami dopłat wymiarowych i </w:t>
-              <w:lastRenderedPageBreak/>
-              <w:t>(dla ZM) matrycą powłoki, w oparciu o dane przekazane przez klienta.</w:t>
+              <w:t>„offer_30.2”...), a poprzednie wersje zostają widoczne pod rozwijaną listą na tej samej karcie. W tym samym okresie dodano trzy nowe typy stali obok HRS/CR/HDG: PICKLED (HRS Trawiona), TEARDROP (Blacha łezkowa) i ZM (Magnelis) - wraz z własnymi tabelami gatunków, matrycami dopłat wymiarowych i (dla ZM) matrycą powłoki, w oparciu o dane przekazane przez klienta.</w:t>
             </w:r>
           </w:p>
         </w:tc>
@@ -509,9 +553,11 @@
           </w:tcPr>
           <w:p>
             <w:r>
-              <w:t xml:space="preserve">Panel administratora zyskał obsługę zatwierdzania, odrzucania i edycji ofert; wysyłka do klienta rozszerzona na starszego handlowca i administratora wraz z zakładkami szybkiego filtrowania; dodane języki czeski i niemiecki oraz sortowanie listy ofert. Dodano panel ustawień administratora (kurs EUR/PLN, PGL </w:t>
+              <w:t xml:space="preserve">Panel administratora zyskał obsługę zatwierdzania, odrzucania i edycji </w:t>
+            </w:r>
+            <w:r>
               <w:lastRenderedPageBreak/>
-              <w:t>bazowe, transport bazowy) oraz przełącznik waluty EURO/PLN w kalkulatorze; oferta zapamiętuje walutę handlowca i kurs z dnia wyceny. Dodano trwałe, unikalne numery ofert wraz z automatyczną nazwą zastępczą „offer_&lt;numer&gt;” dla ofert bez tytułu oraz wyszukiwarkę ofert (po nazwie, nazwie zastępczej i numerze); uprawnienia administratora zrównane ze starszym handlowcem na własnych ofertach.</w:t>
+              <w:t>ofert; wysyłka do klienta rozszerzona na starszego handlowca i administratora wraz z zakładkami szybkiego filtrowania; dodane języki czeski i niemiecki oraz sortowanie listy ofert. Dodano panel ustawień administratora (kurs EUR/PLN, PGL bazowe, transport bazowy) oraz przełącznik waluty EURO/PLN w kalkulatorze; oferta zapamiętuje walutę handlowca i kurs z dnia wyceny. Dodano trwałe, unikalne numery ofert wraz z automatyczną nazwą zastępczą „offer_&lt;numer&gt;” dla ofert bez tytułu oraz wyszukiwarkę ofert (po nazwie, nazwie zastępczej i numerze); uprawnienia administratora zrównane ze starszym handlowcem na własnych ofertach.</w:t>
             </w:r>
           </w:p>
         </w:tc>
@@ -661,7 +707,7 @@
           </w:tcPr>
           <w:p>
             <w:r>
-              <w:t xml:space="preserve">Wersja bazowa  - stan wyjściowy aplikacji.</w:t>
+              <w:t>Wersja bazowa  - stan wyjściowy aplikacji.</w:t>
             </w:r>
           </w:p>
         </w:tc>
@@ -769,7 +815,11 @@
           </w:tcPr>
           <w:p>
             <w:r>
-              <w:t>Dokumentacja repozytorium — README opisywał stan sprzed kilku wersji: brakowało transportu liczonego z trasy, zespołów seniora, metryk handlowców i całej wersji 1.8, a lista migracji bazy urywała się na 018. Opis funkcji został przepisany i pogrupowany w sekcje, listę migracji zastąpiono pętlą po katalogu migrations (nie zdezaktualizuje się przy kolejnej migracji), doszła tabela zmiennych środowiskowych wraz z kluczem do wyznaczania tras oraz opis uruchomienia środowiska lokalnego jednym skryptem. Odświeżono także trzy zrzuty ekranu kalkulatora — poprzednie pochodziły z lipca i pokazywały wersję 1.0 z trzema typami stali zamiast obecnych sześciu. Zaktualizowano również opis repozytorium na GitHubie (sekcja „About”), który nadal mówił o wersji 1.5.</w:t>
+              <w:t xml:space="preserve">Dokumentacja repozytorium - README opisywał stan sprzed kilku wersji: brakowało transportu liczonego z trasy, zespołów seniora, metryk handlowców i całej wersji 1.8, a lista migracji bazy urywała się na 018. Opis funkcji został przepisany i pogrupowany w sekcje, listę migracji zastąpiono </w:t>
+            </w:r>
+            <w:r>
+              <w:lastRenderedPageBreak/>
+              <w:t>pętlą po katalogu migrations (nie zdezaktualizuje się przy kolejnej migracji), doszła tabela zmiennych środowiskowych wraz z kluczem do wyznaczania tras oraz opis uruchomienia środowiska lokalnego jednym skryptem. Odświeżono także trzy zrzuty ekranu kalkulatora - poprzednie pochodziły z lipca i pokazywały wersję 1.0 z trzema typami stali zamiast obecnych sześciu. Zaktualizowano również opis repozytorium na GitHubie (sekcja „About”), który nadal mówił o wersji 1.5.</w:t>
             </w:r>
           </w:p>
         </w:tc>
@@ -781,6 +831,7 @@
           </w:tcPr>
           <w:p>
             <w:r>
+              <w:lastRenderedPageBreak/>
               <w:t>Zmiana</w:t>
             </w:r>
           </w:p>
@@ -830,8 +881,8 @@
         <w:tblLook w:val="04A0" w:firstRow="1" w:lastRow="0" w:firstColumn="1" w:lastColumn="0" w:noHBand="0" w:noVBand="1"/>
       </w:tblPr>
       <w:tblGrid>
-        <w:gridCol w:w="1964"/>
-        <w:gridCol w:w="6892"/>
+        <w:gridCol w:w="1963"/>
+        <w:gridCol w:w="6893"/>
       </w:tblGrid>
       <w:tr>
         <w:tc>
@@ -845,7 +896,6 @@
                 <w:b/>
                 <w:color w:val="1F2A44"/>
               </w:rPr>
-              <w:lastRenderedPageBreak/>
               <w:t>Typ</w:t>
             </w:r>
           </w:p>
@@ -883,7 +933,7 @@
           </w:tcPr>
           <w:p>
             <w:r>
-              <w:t>Dopłata dodatkowa — pozycja z niezerową dopłatą dodatkową zyskała opcjonalne pole komentarza (widoczne dopiero po wpisaniu wartości różnej od zera, chowane — ale nie kasowane — przy powrocie do zera) oraz osobny checkbox „Dołącz komentarz do PDF” (domyślnie odznaczony). Komentarz zapisuje się razem z resztą konfiguracji pozycji i jest poprawnie odtwarzany przy edycji zestawienia. Po zaznaczeniu checkboxa trafia jako dodatkowy wpis do kolumny „Uwagi” w PDF oferty — spójnie we wszystkich czterech miejscach eksportu (kalkulator, Moje oferty, Panel seniora, Panel administratora).</w:t>
+              <w:t>Dopłata dodatkowa - pozycja z niezerową dopłatą dodatkową zyskała opcjonalne pole komentarza (widoczne dopiero po wpisaniu wartości różnej od zera, chowane - ale nie kasowane - przy powrocie do zera) oraz osobny checkbox „Dołącz komentarz do PDF” (domyślnie odznaczony). Komentarz zapisuje się razem z resztą konfiguracji pozycji i jest poprawnie odtwarzany przy edycji zestawienia. Po zaznaczeniu checkboxa trafia jako dodatkowy wpis do kolumny „Uwagi” w PDF oferty - spójnie we wszystkich czterech miejscach eksportu (kalkulator, Moje oferty, Panel seniora, Panel administratora).</w:t>
             </w:r>
           </w:p>
         </w:tc>
@@ -905,7 +955,7 @@
           </w:tcPr>
           <w:p>
             <w:r>
-              <w:t>Gatunek jednorazowy — handlowiec może wycenić gatunek spoza cennika. Po wpisaniu nazwy, której nie ma w tabeli danego typu stali, na górze listy podpowiedzi pojawia się pozycja „Gatunek jednorazowy”, a po jej wybraniu — pole dopłaty [EUR/t] tuż pod polem gatunku. Wartość wchodzi do dopłaty gatunkowej i dalej do ceny końcowej na zwykłych zasadach (działa też przy przełączeniu widoku na PLN). Gatunek żyje wyłącznie w obrębie danej oferty: zapisuje się razem z pozycją, więc cena odtwarza się poprawnie przy edycji zestawienia i ponownym otwarciu oferty, ale nie trafia do cennika i nie pojawia się w podpowiedziach w innych ofertach ani u innych handlowców. W PDF i w Excelu widoczna jest sama nazwa gatunku — oznaczenie „jednorazowy” jest wyłącznie wewnętrzne (kalkulator i zestawienie). Przy okazji poprawiono wcześniejsze zachowanie, w którym wpisanie nieznanego gatunku po cichu ustawiało dopłatę gatunkową na 0, bez żadnego ostrzeżenia dla handlowca.</w:t>
+              <w:t>Gatunek jednorazowy - handlowiec może wycenić gatunek spoza cennika. Po wpisaniu nazwy, której nie ma w tabeli danego typu stali, na górze listy podpowiedzi pojawia się pozycja „Gatunek jednorazowy”, a po jej wybraniu - pole dopłaty [EUR/t] tuż pod polem gatunku. Wartość wchodzi do dopłaty gatunkowej i dalej do ceny końcowej na zwykłych zasadach (działa też przy przełączeniu widoku na PLN). Gatunek żyje wyłącznie w obrębie danej oferty: zapisuje się razem z pozycją, więc cena odtwarza się poprawnie przy edycji zestawienia i ponownym otwarciu oferty, ale nie trafia do cennika i nie pojawia się w podpowiedziach w innych ofertach ani u innych handlowców. W PDF i w Excelu widoczna jest sama nazwa gatunku - oznaczenie „jednorazowy” jest wyłącznie wewnętrzne (kalkulator i zestawienie). Przy okazji poprawiono wcześniejsze zachowanie, w którym wpisanie nieznanego gatunku po cichu ustawiało dopłatę gatunkową na 0, bez żadnego ostrzeżenia dla handlowca.</w:t>
             </w:r>
           </w:p>
         </w:tc>
@@ -927,7 +977,7 @@
           </w:tcPr>
           <w:p>
             <w:r>
-              <w:t>Odbiór własny w transporcie — w panelu „Trasa i transport” doszedł checkbox „Odbiór własny”: gdy klient sam odbiera towar spod zakładu, transport ustawia się na 0 €/t, a reszta pól trasy (adres, kilometry, ponadgabaryt, tryb ręczny) zostaje wyszarzona i nieaktywna. Wartość 0 przenosi się też na już dodane pozycje zestawienia — tym samym mechanizmem, który dotąd aktualizował transport po przeliczeniu trasy.</w:t>
+              <w:t>Odbiór własny w transporcie - w panelu „Trasa i transport” doszedł checkbox „Odbiór własny”: gdy klient sam odbiera towar spod zakładu, transport ustawia się na 0 €/t, a reszta pól trasy (adres, kilometry, ponadgabaryt, tryb ręczny) zostaje wyszarzona i nieaktywna. Wartość 0 przenosi się też na już dodane pozycje zestawienia - tym samym mechanizmem, który dotąd aktualizował transport po przeliczeniu trasy.</w:t>
             </w:r>
           </w:p>
         </w:tc>
@@ -949,7 +999,11 @@
           </w:tcPr>
           <w:p>
             <w:r>
-              <w:t>Harmonogram kwartalny PGL — w panelu administratora sekcja „Konfiguracja” zyskała jedną tabelę PGL bazowego: wiersz na typ stali (HRS, CR, HDG, PICKLED, TEARDROP, ZM), kolumna bieżącego miesiąca oraz kolumny Q1–Q4 wybranego roku (przełącznik roku obok nagłówka). Administrator może wpisać cenę na przyszły kwartał z wyprzedzeniem — kalkulator zaczyna jej używać sam, z chwilą rozpoczęcia tego kwartału, bez żadnej dodatkowej akcji. Kolumna bieżącego miesiąca pokazuje cenę obowiązującą w danej chwili: gdy pochodzi z zaplanowanego kwartału, jest tylko do odczytu i oznaczona numerem tego kwartału (edycja odbywa się w jego kolumnie), a gdy dla trwającego kwartału nic nie zaplanowano — pozostaje zwykłym polem z dotychczasową wartością ręczną. Aktywny kwartał jest w tabeli wyróżniony. Zaplanowane ceny wpływają wyłącznie na wartość startową NOWEJ kalkulacji oraz na próg wymagający zatwierdzenia oferty; oferty zapisane, oczekujące na akceptację i wysłane zachowują PGL z dnia wyceny. Funkcja wymaga migracji bazy danych (021_create_pgl_quarterly_prices.sql).</w:t>
+              <w:t xml:space="preserve">Harmonogram kwartalny PGL - w panelu administratora sekcja „Konfiguracja” zyskała jedną tabelę PGL bazowego: wiersz na typ stali </w:t>
+            </w:r>
+            <w:r>
+              <w:lastRenderedPageBreak/>
+              <w:t>(HRS, CR, HDG, PICKLED, TEARDROP, ZM), kolumna bieżącego miesiąca oraz kolumny Q1–Q4 wybranego roku (przełącznik roku obok nagłówka). Administrator może wpisać cenę na przyszły kwartał z wyprzedzeniem - kalkulator zaczyna jej używać sam, z chwilą rozpoczęcia tego kwartału, bez żadnej dodatkowej akcji. Kolumna bieżącego miesiąca pokazuje cenę obowiązującą w danej chwili: gdy pochodzi z zaplanowanego kwartału, jest tylko do odczytu i oznaczona numerem tego kwartału (edycja odbywa się w jego kolumnie), a gdy dla trwającego kwartału nic nie zaplanowano - pozostaje zwykłym polem z dotychczasową wartością ręczną. Aktywny kwartał jest w tabeli wyróżniony. Zaplanowane ceny wpływają wyłącznie na wartość startową NOWEJ kalkulacji oraz na próg wymagający zatwierdzenia oferty; oferty zapisane, oczekujące na akceptację i wysłane zachowują PGL z dnia wyceny. Funkcja wymaga migracji bazy danych (021_create_pgl_quarterly_prices.sql).</w:t>
             </w:r>
           </w:p>
         </w:tc>
@@ -961,6 +1015,7 @@
           </w:tcPr>
           <w:p>
             <w:r>
+              <w:lastRenderedPageBreak/>
               <w:t>Nowa funkcja</w:t>
             </w:r>
           </w:p>
@@ -993,7 +1048,7 @@
           </w:tcPr>
           <w:p>
             <w:r>
-              <w:t>Okres ważności oferty — obok przełącznika Arkusz/Krąg doszły dwa pola daty, „Ważna od” i „Ważna do”, określające okres, na jaki wyceniana jest oferta. Kwartał wyznaczony z daty „Ważna od” automatycznie dobiera PGL bazowe zaplanowane w harmonogramie kwartalnym (patrz wyżej, harmonogram kwartalny PGL) dla tego kwartału — dokładnie tą samą logiką co dotychczasowe przełączanie na bieżący kwartał, tylko sparametryzowaną wybranym okresem zamiast „teraz”. Gdy zakres „od”–„do” wykracza poza jeden kwartał, PGL nie jest dobierane automatycznie i pojawia się czerwone ostrzeżenie — administrator planuje ceny per kwartał, więc taki zakres byłby niejednoznaczny. Zmiana typu stali po ustawieniu okresu nadal resetuje PGL do wartości dla nowego typu w tym samym kwartale. Obie daty zapisują się razem z resztą oferty (jak dotychczasowy pglBase/transport) i odtwarzają się przy ponownym otwarciu bez ponownego przeliczania — zapisana oferta zachowuje PGL z dnia wyceny, tak samo jak przy zwykłej zmianie typu stali.</w:t>
+              <w:t>Okres ważności oferty - obok przełącznika Arkusz/Krąg doszły dwa pola daty, „Ważna od” i „Ważna do”, określające okres, na jaki wyceniana jest oferta. Kwartał wyznaczony z daty „Ważna od” automatycznie dobiera PGL bazowe zaplanowane w harmonogramie kwartalnym (patrz wyżej, harmonogram kwartalny PGL) dla tego kwartału - dokładnie tą samą logiką co dotychczasowe przełączanie na bieżący kwartał, tylko sparametryzowaną wybranym okresem zamiast „teraz”. Gdy zakres „od”–„do” wykracza poza jeden kwartał, PGL nie jest dobierane automatycznie i pojawia się czerwone ostrzeżenie - administrator planuje ceny per kwartał, więc taki zakres byłby niejednoznaczny. Zmiana typu stali po ustawieniu okresu nadal resetuje PGL do wartości dla nowego typu w tym samym kwartale. Obie daty zapisują się razem z resztą oferty (jak dotychczasowy pglBase/transport) i odtwarzają się przy ponownym otwarciu bez ponownego przeliczania - zapisana oferta zachowuje PGL z dnia wyceny, tak samo jak przy zwykłej zmianie typu stali.</w:t>
             </w:r>
           </w:p>
         </w:tc>
@@ -1015,7 +1070,52 @@
           </w:tcPr>
           <w:p>
             <w:r>
-              <w:t>Zapis ustawień nie nadpisuje już ręcznej ceny bazowej PGL ceną kwartalną. Gdy dla danego typu stali obowiązywała cena zaplanowana na bieżący kwartał, formularz ustawień trzymał właśnie tę wartość i przy zapisie karty odsyłał ją do kolumny z ceną ręczną — czyli do wartości, z której kalkulator korzysta po zakończeniu kwartału, gdy kolejny nie ma jeszcze zaplanowanej ceny. Działo się to przy każdym zapisie tej karty, również wtedy, gdy administrator zmieniał wyłącznie kurs waluty. Po poprawce zapis pomija ceny bazowe tych typów, dla których bieżący kwartał ma zaplanowaną cenę — ich pola i tak są w tabeli tylko do odczytu. Błąd wykryty i naprawiony przed wdrożeniem wersji 1.8.</w:t>
+              <w:t>Zapis ustawień nie nadpisuje już ręcznej ceny bazowej PGL ceną kwartalną. Gdy dla danego typu stali obowiązywała cena zaplanowana na bieżący kwartał, formularz ustawień trzymał właśnie tę wartość i przy zapisie karty odsyłał ją do kolumny z ceną ręczną - czyli do wartości, z której kalkulator korzysta po zakończeniu kwartału, gdy kolejny nie ma jeszcze zaplanowanej ceny. Działo się to przy każdym zapisie tej karty, również wtedy, gdy administrator zmieniał wyłącznie kurs waluty. Po poprawce zapis pomija ceny bazowe tych typów, dla których bieżący kwartał ma zaplanowaną cenę - ich pola i tak są w tabeli tylko do odczytu. Błąd wykryty i naprawiony przed wdrożeniem wersji 1.8.</w:t>
+            </w:r>
+          </w:p>
+        </w:tc>
+      </w:tr>
+      <w:tr>
+        <w:tc>
+          <w:tcPr>
+            <w:tcW w:w="1948" w:type="dxa"/>
+          </w:tcPr>
+          <w:p>
+            <w:r>
+              <w:lastRenderedPageBreak/>
+              <w:t>Poprawka</w:t>
+            </w:r>
+          </w:p>
+        </w:tc>
+        <w:tc>
+          <w:tcPr>
+            <w:tcW w:w="6908" w:type="dxa"/>
+          </w:tcPr>
+          <w:p>
+            <w:r>
+              <w:t>Widoczność ostrzeżeń o cenie poniżej progu - komunikaty „PGL poniżej bazy” i „marża poniżej minimum” były drobnym żółtym tekstem z ikoną ⚠, słabo zauważalnym na liście parametrów; handlowcy zgłaszali, że łatwo je przeoczyć, mimo że pozycja z taką wartością wymaga później zatwierdzenia oferty (patrz lib/offerReview.ts). Oba komunikaty przeniesiono do wyraźnie odznaczonego, czerwono obramowanego bloku z pogrubionym tekstem, zamiast dotychczasowej cienkiej żółtej linijki.</w:t>
+            </w:r>
+          </w:p>
+        </w:tc>
+      </w:tr>
+      <w:tr>
+        <w:tc>
+          <w:tcPr>
+            <w:tcW w:w="1948" w:type="dxa"/>
+          </w:tcPr>
+          <w:p>
+            <w:r>
+              <w:t>Zmiana</w:t>
+            </w:r>
+          </w:p>
+        </w:tc>
+        <w:tc>
+          <w:tcPr>
+            <w:tcW w:w="6908" w:type="dxa"/>
+          </w:tcPr>
+          <w:p>
+            <w:r>
+              <w:t>Złom w podsumowaniu SSC - dotąd stała kwota 10 €/t (SCRAP_CONSTANT w kodzie), teraz % ceny wsadu (PGL + Σ Huta), domyślnie 2%. Procent jest konfigurowalny przez administratora w Ustawieniach (nowe pole „Złom (%)”, walidacja 0–100, ten sam mechanizm co minimalna marża) i zapisany w bazie (migracja 022_add_scrap_pct.sql). Wiersz „Złom” w podsumowaniu pokazuje teraz aktualny procent i przeliczoną kwotę zamiast dotychczasowego oznaczenia „(stała)”. Tą samą logiką zaktualizowano też dwa niezależne, samodzielne kalkulatory HTML w repozytorium (index.html, steel_calculator_standalone.html).</w:t>
             </w:r>
           </w:p>
         </w:tc>
@@ -1037,7 +1137,7 @@
           </w:tcPr>
           <w:p>
             <w:r>
-              <w:t>Widoczność ostrzeżeń o cenie poniżej progu — komunikaty „PGL poniżej bazy” i „marża poniżej minimum” były drobnym żółtym tekstem z ikoną ⚠, słabo zauważalnym na liście parametrów; handlowcy zgłaszali, że łatwo je przeoczyć, mimo że pozycja z taką wartością wymaga później zatwierdzenia oferty (patrz lib/offerReview.ts). Oba komunikaty przeniesiono do wyraźnie odznaczonego, czerwono obramowanego bloku z pogrubionym tekstem, zamiast dotychczasowej cienkiej żółtej linijki.</w:t>
+              <w:t>Historia zmian cen bazowych PGL nie rejestrowała zmian wprowadzanych przez harmonogram kwartalny. Gdy dla danego typu stali bieżący kwartał miał zaplanowaną cenę, pole ręczne w tabeli było tylko do odczytu, a jedynym sposobem na zmianę ceny „teraz” była edycja komórki tego kwartału - ten zapis szedł osobnym mechanizmem (PUT /api/settings/pgl-quarterly) i nie trafiał do logu historii, mimo że cena faktycznie się zmieniała. Po poprawce zmiana ceny bieżącego kwartału jest logowana tym samym mechanizmem co ręczna zmiana ceny bazowej, a panel odświeża tabelę historii również po zapisie harmonogramu.</w:t>
             </w:r>
           </w:p>
         </w:tc>
@@ -1059,51 +1159,7 @@
           </w:tcPr>
           <w:p>
             <w:r>
-              <w:t>Złom w podsumowaniu SSC — dotąd stała kwota 10 €/t (SCRAP_CONSTANT w kodzie), teraz % ceny wsadu (PGL + Σ Huta), domyślnie 2%. Procent jest konfigurowalny przez administratora w Ustawieniach (nowe pole „Złom (%)”, walidacja 0–100, ten sam mechanizm co minimalna marża) i zapisany w bazie (migracja 022_add_scrap_pct.sql). Wiersz „Złom” w podsumowaniu pokazuje teraz aktualny procent i przeliczoną kwotę zamiast dotychczasowego oznaczenia „(stała)”. Tą samą logiką zaktualizowano też dwa niezależne, samodzielne kalkulatory HTML w repozytorium (index.html, steel_calculator_standalone.html).</w:t>
-            </w:r>
-          </w:p>
-        </w:tc>
-      </w:tr>
-      <w:tr>
-        <w:tc>
-          <w:tcPr>
-            <w:tcW w:w="1948" w:type="dxa"/>
-          </w:tcPr>
-          <w:p>
-            <w:r>
-              <w:t>Poprawka</w:t>
-            </w:r>
-          </w:p>
-        </w:tc>
-        <w:tc>
-          <w:tcPr>
-            <w:tcW w:w="6908" w:type="dxa"/>
-          </w:tcPr>
-          <w:p>
-            <w:r>
-              <w:t>Historia zmian cen bazowych PGL nie rejestrowała zmian wprowadzanych przez harmonogram kwartalny. Gdy dla danego typu stali bieżący kwartał miał zaplanowaną cenę, pole ręczne w tabeli było tylko do odczytu, a jedynym sposobem na zmianę ceny „teraz” była edycja komórki tego kwartału — ten zapis szedł osobnym mechanizmem (PUT /api/settings/pgl-quarterly) i nie trafiał do logu historii, mimo że cena faktycznie się zmieniała. Po poprawce zmiana ceny bieżącego kwartału jest logowana tym samym mechanizmem co ręczna zmiana ceny bazowej, a panel odświeża tabelę historii również po zapisie harmonogramu.</w:t>
-            </w:r>
-          </w:p>
-        </w:tc>
-      </w:tr>
-      <w:tr>
-        <w:tc>
-          <w:tcPr>
-            <w:tcW w:w="1948" w:type="dxa"/>
-          </w:tcPr>
-          <w:p>
-            <w:r>
-              <w:t>Zmiana</w:t>
-            </w:r>
-          </w:p>
-        </w:tc>
-        <w:tc>
-          <w:tcPr>
-            <w:tcW w:w="6908" w:type="dxa"/>
-          </w:tcPr>
-          <w:p>
-            <w:r>
-              <w:t>Złom zaokrąglony do liczby całkowitej — na polecenie zarządu kwota złomu w podsumowaniu SSC (obliczana jako % ceny wsadu) jest teraz zaokrąglana do pełnej jednostki waluty, zamiast dotychczasowych dwóch miejsc po przecinku. Zaokrąglenie następuje na poziomie obliczeń, więc wpływa też na sumę SSC i cenę końcową pozycji, nie tylko na sam wygląd wiersza „Złom”.</w:t>
+              <w:t>Złom zaokrąglony do liczby całkowitej - na polecenie zarządu kwota złomu w podsumowaniu SSC (obliczana jako % ceny wsadu) jest teraz zaokrąglana do pełnej jednostki waluty, zamiast dotychczasowych dwóch miejsc po przecinku. Zaokrąglenie następuje na poziomie obliczeń, więc wpływa też na sumę SSC i cenę końcową pozycji, nie tylko na sam wygląd wiersza „Złom”.</w:t>
             </w:r>
           </w:p>
         </w:tc>
@@ -1125,7 +1181,11 @@
           </w:tcPr>
           <w:p>
             <w:r>
-              <w:t>Termin płatności — obok pól „Ważna od”/„Ważna do” (okres ważności oferty) doszła osobna para pól „Termin płatności od” i „Termin płatności do”, niezależna od okresu ważności. Wybranie daty „od” automatycznie dolicza „do” jako „od” + liczba dni — indywidualny termin przypisany klientowi, jeśli taki ma, albo globalny termin domyślny ustawiony w Ustawieniach (domyślnie 7 dni), ale pole „do” zostaje w pełni edytowalne ręcznie — ponowna zmiana „od” przelicza je od nowa. Panel „Klienci” pozwala przypisać każdej firmie własny termin płatności w dniach (puste pole = dziedziczenie globalnego domyślnego); dostępny jest teraz nie tylko dla administratora (/admin/klienci), ale też dla starszego handlowca w nowej zakładce „Klienci” w Panelu Seniora, gdzie może zmieniać wyłącznie ten jeden parametr klienta — ograniczenie wymuszone po stronie serwera, nie tylko ukryte w interfejsie. Administrator konfiguruje globalny domyślny termin w Ustawieniach (nowe pole „Domyślny termin płatności (dni)”, walidacja 0–365, ten sam mechanizm co minimalna marża czy złom). Funkcja wymaga migracji bazy danych (023_add_payment_term.sql, kolumny app_settings.payment_term_days i clients.payment_term_days).</w:t>
+              <w:t xml:space="preserve">Termin płatności - obok pól „Ważna od”/„Ważna do” (okres ważności oferty) doszła osobna para pól „Termin płatności od” i „Termin płatności do”, niezależna od okresu ważności. Wybranie daty „od” automatycznie dolicza „do” jako „od” + liczba dni - indywidualny termin przypisany klientowi, jeśli taki ma, albo globalny termin domyślny ustawiony w Ustawieniach (domyślnie 7 dni), ale pole „do” zostaje w pełni edytowalne ręcznie - ponowna zmiana „od” przelicza je od nowa. Panel „Klienci” pozwala przypisać każdej firmie własny termin płatności w dniach (puste pole = dziedziczenie globalnego domyślnego); dostępny jest teraz nie tylko dla administratora (/admin/klienci), ale też dla starszego handlowca w nowej zakładce „Klienci” w Panelu Seniora, gdzie może zmieniać wyłącznie ten jeden parametr klienta - ograniczenie wymuszone po stronie serwera, nie tylko ukryte w interfejsie. Administrator konfiguruje globalny domyślny termin w Ustawieniach (nowe pole „Domyślny termin płatności (dni)”, walidacja 0–365, ten sam mechanizm co minimalna marża czy </w:t>
+            </w:r>
+            <w:r>
+              <w:lastRenderedPageBreak/>
+              <w:t>złom). Funkcja wymaga migracji bazy danych (023_add_payment_term.sql, kolumny app_settings.payment_term_days i clients.payment_term_days).</w:t>
             </w:r>
           </w:p>
         </w:tc>
@@ -1141,6 +1201,7 @@
           <w:color w:val="2B57A6"/>
           <w:sz w:val="26"/>
         </w:rPr>
+        <w:lastRenderedPageBreak/>
         <w:t>Zarządzanie ofertami</w:t>
       </w:r>
     </w:p>
@@ -1155,6 +1216,97 @@
           <w:sz w:val="18"/>
         </w:rPr>
         <w:t>Tworzenie, zapis, lista, edycja, duplikowanie i usuwanie ofert.</w:t>
+      </w:r>
+    </w:p>
+    <w:tbl>
+      <w:tblPr>
+        <w:tblStyle w:val="Tabela-Siatka"/>
+        <w:tblW w:w="0" w:type="auto"/>
+        <w:tblLook w:val="04A0" w:firstRow="1" w:lastRow="0" w:firstColumn="1" w:lastColumn="0" w:noHBand="0" w:noVBand="1"/>
+      </w:tblPr>
+      <w:tblGrid>
+        <w:gridCol w:w="1945"/>
+        <w:gridCol w:w="6911"/>
+      </w:tblGrid>
+      <w:tr>
+        <w:tc>
+          <w:tcPr>
+            <w:tcW w:w="1984" w:type="dxa"/>
+            <w:shd w:val="clear" w:color="auto" w:fill="EEF2F8"/>
+          </w:tcPr>
+          <w:p>
+            <w:r>
+              <w:rPr>
+                <w:b/>
+                <w:color w:val="1F2A44"/>
+              </w:rPr>
+              <w:t>Typ</w:t>
+            </w:r>
+          </w:p>
+        </w:tc>
+        <w:tc>
+          <w:tcPr>
+            <w:tcW w:w="7087" w:type="dxa"/>
+            <w:shd w:val="clear" w:color="auto" w:fill="EEF2F8"/>
+          </w:tcPr>
+          <w:p>
+            <w:r>
+              <w:rPr>
+                <w:b/>
+                <w:color w:val="1F2A44"/>
+              </w:rPr>
+              <w:t>Opis zmiany</w:t>
+            </w:r>
+          </w:p>
+        </w:tc>
+      </w:tr>
+      <w:tr>
+        <w:tc>
+          <w:tcPr>
+            <w:tcW w:w="1948" w:type="dxa"/>
+          </w:tcPr>
+          <w:p>
+            <w:r>
+              <w:t>Nowa funkcja</w:t>
+            </w:r>
+          </w:p>
+        </w:tc>
+        <w:tc>
+          <w:tcPr>
+            <w:tcW w:w="6908" w:type="dxa"/>
+          </w:tcPr>
+          <w:p>
+            <w:r>
+              <w:t>Migracja przeterminowanego PGL przy edycji i duplikowaniu oferty - gdy zapisana oferta była wyceniona w innym kwartale niż bieżący (harmonogram kwartalny PGL, patrz wyżej), otwarcie jej do edycji albo do edycji świeżo zduplikowanej kopii automatycznie podmienia PGL bazowe oraz PGL i przeliczoną marżę/cenę/wartość każdej pozycji zestawienia na aktualne dla bieżącego kwartału (dla każdego typu stali osobno), a okres ważności „Ważna od”/„Ważna do” przesuwa na dzisiejszą datę z zachowaniem oryginalnej długości zakresu. Zmiana nie blokuje edycji i nie zapisuje się automatycznie - handlowiec widzi wyraźny baner z informacją, na jaki kwartał oferta była pierwotnie wyceniona i ile pozycji zostało przeliczonych, a dane trafiają do bazy dopiero po ręcznym zapisaniu (tworząc, jak zwykle, nową wersję oferty). Pozycje sprzed wprowadzenia pełnej konfiguracji dopłat (starsze oferty bez zapisanego „inputs”) dostają wyłącznie podmienione PGL bez przeliczenia marży i ceny - baner osobno informuje, ile takich pozycji wymaga ręcznego sprawdzenia. Duplikowanie samo w sobie nadal tylko kopiuje ofertę; migracja uruchamia się dopiero przy otwarciu takiej kopii do edycji, tą samą ścieżką co zwykła edycja. Funkcja nie wymaga migracji bazy danych.</w:t>
+            </w:r>
+          </w:p>
+        </w:tc>
+      </w:tr>
+    </w:tbl>
+    <w:p>
+      <w:pPr>
+        <w:spacing w:before="240" w:after="40"/>
+      </w:pPr>
+      <w:r>
+        <w:rPr>
+          <w:b/>
+          <w:color w:val="2B57A6"/>
+          <w:sz w:val="26"/>
+        </w:rPr>
+        <w:t>Eksport PDF</w:t>
+      </w:r>
+    </w:p>
+    <w:p>
+      <w:pPr>
+        <w:spacing w:after="80"/>
+      </w:pPr>
+      <w:r>
+        <w:rPr>
+          <w:i/>
+          <w:color w:val="666666"/>
+          <w:sz w:val="18"/>
+        </w:rPr>
+        <w:t>Wygląd i zawartość oferty PDF, dane klienta.</w:t>
       </w:r>
     </w:p>
     <w:tbl>
@@ -1216,76 +1368,7 @@
           </w:tcPr>
           <w:p>
             <w:r>
-              <w:t>Migracja przeterminowanego PGL przy edycji i duplikowaniu oferty — gdy zapisana oferta była wyceniona w innym kwartale niż bieżący (harmonogram kwartalny PGL, patrz wyżej), otwarcie jej do edycji albo do edycji świeżo zduplikowanej kopii automatycznie podmienia PGL bazowe oraz PGL i przeliczoną marżę/cenę/wartość każdej pozycji zestawienia na aktualne dla bieżącego kwartału (dla każdego typu stali osobno), a okres ważności „Ważna od”/„Ważna do” przesuwa na dzisiejszą datę z zachowaniem oryginalnej długości zakresu. Zmiana nie blokuje edycji i nie zapisuje się automatycznie — handlowiec widzi wyraźny baner z informacją, na jaki kwartał oferta była pierwotnie wyceniona i ile pozycji zostało przeliczonych, a dane trafiają do bazy dopiero po ręcznym zapisaniu (tworząc, jak zwykle, nową wersję oferty). Pozycje sprzed wprowadzenia pełnej konfiguracji dopłat (starsze oferty bez zapisanego „inputs”) dostają wyłącznie podmienione PGL bez przeliczenia marży i ceny — baner osobno informuje, ile takich pozycji wymaga ręcznego sprawdzenia. Duplikowanie samo w sobie nadal tylko kopiuje ofertę; migracja uruchamia się dopiero przy otwarciu takiej kopii do edycji, tą samą ścieżką co zwykła edycja. Funkcja nie wymaga migracji bazy danych.</w:t>
-            </w:r>
-          </w:p>
-        </w:tc>
-      </w:tr>
-    </w:tbl>
-    <w:p>
-      <w:pPr>
-        <w:spacing w:before="240" w:after="40"/>
-      </w:pPr>
-      <w:r>
-        <w:rPr>
-          <w:b/>
-          <w:color w:val="2B57A6"/>
-          <w:sz w:val="26"/>
-        </w:rPr>
-        <w:t>Eksport PDF</w:t>
-      </w:r>
-    </w:p>
-    <w:p>
-      <w:pPr>
-        <w:spacing w:after="80"/>
-      </w:pPr>
-      <w:r>
-        <w:rPr>
-          <w:i/>
-          <w:color w:val="666666"/>
-          <w:sz w:val="18"/>
-        </w:rPr>
-        <w:t>Wygląd i zawartość oferty PDF, dane klienta.</w:t>
-      </w:r>
-    </w:p>
-    <w:tbl>
-      <w:tblPr>
-        <w:tblStyle w:val="Tabela-Siatka"/>
-        <w:tblW w:w="0" w:type="auto"/>
-        <w:tblLook w:val="04A0" w:firstRow="1" w:lastRow="0" w:firstColumn="1" w:lastColumn="0" w:noHBand="0" w:noVBand="1"/>
-      </w:tblPr>
-      <w:tblGrid>
-        <w:gridCol w:w="1948"/>
-        <w:gridCol w:w="6908"/>
-      </w:tblGrid>
-      <w:tr>
-        <w:tc>
-          <w:tcPr>
-            <w:tcW w:w="1984" w:type="dxa"/>
-            <w:shd w:val="clear" w:color="auto" w:fill="EEF2F8"/>
-          </w:tcPr>
-          <w:p>
-            <w:r>
-              <w:rPr>
-                <w:b/>
-                <w:color w:val="1F2A44"/>
-              </w:rPr>
-              <w:t>Typ</w:t>
-            </w:r>
-          </w:p>
-        </w:tc>
-        <w:tc>
-          <w:tcPr>
-            <w:tcW w:w="7087" w:type="dxa"/>
-            <w:shd w:val="clear" w:color="auto" w:fill="EEF2F8"/>
-          </w:tcPr>
-          <w:p>
-            <w:r>
-              <w:rPr>
-                <w:b/>
-                <w:color w:val="1F2A44"/>
-              </w:rPr>
-              <w:t>Opis zmiany</w:t>
+              <w:t>Okres ważności oferty w PDF - gdy w kalkulatorze wypełniono obie daty „Ważna od”/„Ważna do”, w stopce oferty pojawia się dodatkowa linijka z wybranym zakresem dat, obok dotychczasowej stałej formułki „Ważność oferty: 48h od daty wystawienia” (która zostaje bez zmian). Linijka renderuje się we wszystkich czterech językach interfejsu (PL/EN/CS/DE) i znika, gdy okres nie został ustawiony - stare oferty bez tych pól nie tracą nic ze swojego PDF-u.</w:t>
             </w:r>
           </w:p>
         </w:tc>
@@ -1307,29 +1390,7 @@
           </w:tcPr>
           <w:p>
             <w:r>
-              <w:t>Okres ważności oferty w PDF — gdy w kalkulatorze wypełniono obie daty „Ważna od”/„Ważna do”, w stopce oferty pojawia się dodatkowa linijka z wybranym zakresem dat, obok dotychczasowej stałej formułki „Ważność oferty: 48h od daty wystawienia” (która zostaje bez zmian). Linijka renderuje się we wszystkich czterech językach interfejsu (PL/EN/CS/DE) i znika, gdy okres nie został ustawiony — stare oferty bez tych pól nie tracą nic ze swojego PDF-u.</w:t>
-            </w:r>
-          </w:p>
-        </w:tc>
-      </w:tr>
-      <w:tr>
-        <w:tc>
-          <w:tcPr>
-            <w:tcW w:w="1948" w:type="dxa"/>
-          </w:tcPr>
-          <w:p>
-            <w:r>
-              <w:t>Nowa funkcja</w:t>
-            </w:r>
-          </w:p>
-        </w:tc>
-        <w:tc>
-          <w:tcPr>
-            <w:tcW w:w="6908" w:type="dxa"/>
-          </w:tcPr>
-          <w:p>
-            <w:r>
-              <w:t>Termin płatności w PDF — gdy w kalkulatorze wypełniono obie daty „Termin płatności od”/„do”, w stopce oferty pojawia się linijka „Termin płatności: {od} – {do}.”, która ZASTĘPUJE dotychczasową ogólną formułkę „Warunki płatności: wg ustaleń indywidualnych” (formułka wraca, gdy termin nie został ustawiony). Renderuje się we wszystkich czterech językach interfejsu (PL/EN/CS/DE), niezależnie od istniejącej linijki okresu ważności oferty.</w:t>
+              <w:t>Termin płatności w PDF - gdy w kalkulatorze wypełniono obie daty „Termin płatności od”/„do”, w stopce oferty pojawia się linijka „Termin płatności: {od} – {do}.”, która ZASTĘPUJE dotychczasową ogólną formułkę „Warunki płatności: wg ustaleń indywidualnych” (formułka wraca, gdy termin nie został ustawiony). Renderuje się we wszystkich czterech językach interfejsu (PL/EN/CS/DE), niezależnie od istniejącej linijki okresu ważności oferty.</w:t>
             </w:r>
           </w:p>
         </w:tc>
@@ -1351,7 +1412,11 @@
           </w:tcPr>
           <w:p>
             <w:r>
-              <w:t>Podsumowanie oferty (wiersz „RAZEM”) w PDF drukowało się po każdej stronie tabeli pozycji zamiast tylko po ostatniej — silnik konwersji HTML→PDF (Abacus, headless Chrome) powtarza nagłówek i stopkę tabeli na każdej stronie, na którą się ona rozleje, więc przy więcej niż ok. 2 pozycjach „RAZEM” pojawiało się po każdej stronie z osobną, niepełną sumą. Podsumowanie jest teraz osobną tabelą za tabelą pozycji, więc renderuje się dokładnie raz, bezpośrednio po ostatniej pozycji, niezależnie ile stron zajęły pozycje. Dotyczyło ofert w obu walutach (EUR i PLN).</w:t>
+              <w:t xml:space="preserve">Podsumowanie oferty (wiersz „RAZEM”) w PDF drukowało się po każdej stronie tabeli pozycji zamiast tylko po ostatniej - silnik konwersji HTML→PDF (Abacus, headless Chrome) powtarza nagłówek i stopkę tabeli </w:t>
+            </w:r>
+            <w:r>
+              <w:lastRenderedPageBreak/>
+              <w:t>na każdej stronie, na którą się ona rozleje, więc przy więcej niż ok. 2 pozycjach „RAZEM” pojawiało się po każdej stronie z osobną, niepełną sumą. Podsumowanie jest teraz osobną tabelą za tabelą pozycji, więc renderuje się dokładnie raz, bezpośrednio po ostatniej pozycji, niezależnie ile stron zajęły pozycje. Dotyczyło ofert w obu walutach (EUR i PLN).</w:t>
             </w:r>
           </w:p>
         </w:tc>
@@ -1363,6 +1428,7 @@
           </w:tcPr>
           <w:p>
             <w:r>
+              <w:lastRenderedPageBreak/>
               <w:t>Poprawka</w:t>
             </w:r>
           </w:p>
@@ -1373,7 +1439,7 @@
           </w:tcPr>
           <w:p>
             <w:r>
-              <w:t>Tekst w kolumnach „Cena”/„Wartość” rozjeżdżał się przy pięciocyfrowych kwotach (częste w ofertach PLN po przeliczeniu kursem) — tabela miała zmienną szerokość kolumn, więc mogła się ona przeliczać niespójnie. Kolumny mają teraz stałą, wspólną szerokość dla całej tabeli, kolumny „Cena” i „Wartość” zostały poszerzone, a liczby przestały się zawijać do kolejnej linii.</w:t>
+              <w:t>Tekst w kolumnach „Cena”/„Wartość” rozjeżdżał się przy pięciocyfrowych kwotach (częste w ofertach PLN po przeliczeniu kursem) - tabela miała zmienną szerokość kolumn, więc mogła się ona przeliczać niespójnie. Kolumny mają teraz stałą, wspólną szerokość dla całej tabeli, kolumny „Cena” i „Wartość” zostały poszerzone, a liczby przestały się zawijać do kolejnej linii.</w:t>
             </w:r>
           </w:p>
         </w:tc>
@@ -1464,7 +1530,7 @@
           </w:tcPr>
           <w:p>
             <w:r>
-              <w:t>Zmiana kolejności pozycji w zestawieniu — każdy wiersz zestawienia zyskał uchwyt do przeciągania po lewej stronie, którym handlowiec może przenieść pozycję w inne miejsce listy; numeracja „Lp.” przelicza się automatycznie, a przesuwanie pozostałych wierszy jest płynnie animowane. Nowa kolejność to jednocześnie kolejność pozycji w eksportowanym PDF, w Excelu i w zapisanej ofercie. Funkcja działa też dotykiem na telefonie i tablecie, nie tylko myszką na komputerze.</w:t>
+              <w:t>Zmiana kolejności pozycji w zestawieniu - każdy wiersz zestawienia zyskał uchwyt do przeciągania po lewej stronie, którym handlowiec może przenieść pozycję w inne miejsce listy; numeracja „Lp.” przelicza się automatycznie, a przesuwanie pozostałych wierszy jest płynnie animowane. Nowa kolejność to jednocześnie kolejność pozycji w eksportowanym PDF, w Excelu i w zapisanej ofercie. Funkcja działa też dotykiem na telefonie i tablecie, nie tylko myszką na komputerze.</w:t>
             </w:r>
           </w:p>
         </w:tc>
@@ -1486,7 +1552,7 @@
           </w:tcPr>
           <w:p>
             <w:r>
-              <w:t>Podsumowanie zestawienia pozycji zyskało widoczny total ilości w tonach — obok dotychczasowej sumy wartości oferty, w tym samym wierszu podsumowującym pod tabelą pozycji. Wiersz podsumowania przeniesiono z osobnego paska pod tabelą do wiersza podsumowującego (tfoot) samej tabeli, dzięki czemu suma ton wyrównuje się dokładnie pod kolumną „Tony”, a suma wartości pod kolumną „Wartość”.</w:t>
+              <w:t>Podsumowanie zestawienia pozycji zyskało widoczny total ilości w tonach - obok dotychczasowej sumy wartości oferty, w tym samym wierszu podsumowującym pod tabelą pozycji. Wiersz podsumowania przeniesiono z osobnego paska pod tabelą do wiersza podsumowującego (tfoot) samej tabeli, dzięki czemu suma ton wyrównuje się dokładnie pod kolumną „Tony”, a suma wartości pod kolumną „Wartość”.</w:t>
             </w:r>
           </w:p>
         </w:tc>
@@ -1542,7 +1608,11 @@
         <w:pStyle w:val="Listapunktowana"/>
       </w:pPr>
       <w:r>
-        <w:t>Funkcje wersji 1.8 (komentarz do dopłaty dodatkowej, gatunek jednorazowy, odbiór własny w transporcie, harmonogram kwartalny PGL oraz migracja przeterminowanego PGL przy edycji/duplikowaniu oferty) są gotowe i przetestowane lokalnie, ale nie zostały jeszcze wdrożone na środowisko produkcyjne; wszystkie poza harmonogramem kwartalnym PGL nie wymagają migracji bazy danych (dane trafiają do istniejącego pola JSONB „offer_data”), natomiast harmonogram kwartalny PGL wymaga uruchomienia migracji 021_create_pgl_quarterly_prices.sql przed podmianą plików aplikacji.</w:t>
+        <w:t xml:space="preserve">Funkcje wersji 1.8 (komentarz do dopłaty dodatkowej, gatunek jednorazowy, odbiór własny w transporcie, harmonogram kwartalny PGL oraz migracja przeterminowanego PGL przy edycji/duplikowaniu oferty) są gotowe i przetestowane lokalnie, ale nie zostały jeszcze wdrożone na środowisko produkcyjne; wszystkie poza harmonogramem kwartalnym PGL nie wymagają migracji bazy danych (dane trafiają do istniejącego pola JSONB „offer_data”), </w:t>
+      </w:r>
+      <w:r>
+        <w:lastRenderedPageBreak/>
+        <w:t>natomiast harmonogram kwartalny PGL wymaga uruchomienia migracji 021_create_pgl_quarterly_prices.sql przed podmianą plików aplikacji.</w:t>
       </w:r>
     </w:p>
     <w:p>
@@ -1563,7 +1633,7 @@
         <w:pStyle w:val="Listapunktowana"/>
       </w:pPr>
       <w:r>
-        <w:t>Wdrożenie wersji 1.8 (komentarz do dopłaty dodatkowej, gatunek jednorazowy, odbiór własny w transporcie, harmonogram kwartalny PGL, migracja przeterminowanego PGL przy edycji/duplikowaniu oferty) na środowisko produkcyjne — wraz z migracją 021_create_pgl_quarterly_prices.sql</w:t>
+        <w:t>Wdrożenie wersji 1.8 (komentarz do dopłaty dodatkowej, gatunek jednorazowy, odbiór własny w transporcie, harmonogram kwartalny PGL, migracja przeterminowanego PGL przy edycji/duplikowaniu oferty) na środowisko produkcyjne - wraz z migracją 021_create_pgl_quarterly_prices.sql</w:t>
       </w:r>
     </w:p>
     <w:p>
@@ -1692,78 +1762,12 @@
       <w:pStyle w:val="Stopka"/>
       <w:jc w:val="center"/>
     </w:pPr>
-    <w:proofErr w:type="spellStart"/>
     <w:r>
       <w:rPr>
         <w:color w:val="666666"/>
         <w:sz w:val="16"/>
       </w:rPr>
-      <w:t>AMSteel</w:t>
-    </w:r>
-    <w:proofErr w:type="spellEnd"/>
-    <w:r>
-      <w:rPr>
-        <w:color w:val="666666"/>
-        <w:sz w:val="16"/>
-      </w:rPr>
-      <w:t xml:space="preserve"> Quote - </w:t>
-    </w:r>
-    <w:proofErr w:type="spellStart"/>
-    <w:r>
-      <w:rPr>
-        <w:color w:val="666666"/>
-        <w:sz w:val="16"/>
-      </w:rPr>
-      <w:t>Raport</w:t>
-    </w:r>
-    <w:proofErr w:type="spellEnd"/>
-    <w:r>
-      <w:rPr>
-        <w:color w:val="666666"/>
-        <w:sz w:val="16"/>
-      </w:rPr>
-      <w:t xml:space="preserve"> </w:t>
-    </w:r>
-    <w:proofErr w:type="spellStart"/>
-    <w:proofErr w:type="gramStart"/>
-    <w:r>
-      <w:rPr>
-        <w:color w:val="666666"/>
-        <w:sz w:val="16"/>
-      </w:rPr>
-      <w:t>wersji</w:t>
-    </w:r>
-    <w:proofErr w:type="spellEnd"/>
-    <w:r>
-      <w:rPr>
-        <w:color w:val="666666"/>
-        <w:sz w:val="16"/>
-      </w:rPr>
-      <w:t xml:space="preserve">  |</w:t>
-    </w:r>
-    <w:proofErr w:type="gramEnd"/>
-    <w:r>
-      <w:rPr>
-        <w:color w:val="666666"/>
-        <w:sz w:val="16"/>
-      </w:rPr>
-      <w:t xml:space="preserve">  Mateusz </w:t>
-    </w:r>
-    <w:proofErr w:type="gramStart"/>
-    <w:r>
-      <w:rPr>
-        <w:color w:val="666666"/>
-        <w:sz w:val="16"/>
-      </w:rPr>
-      <w:t>Mazur  |</w:t>
-    </w:r>
-    <w:proofErr w:type="gramEnd"/>
-    <w:r>
-      <w:rPr>
-        <w:color w:val="666666"/>
-        <w:sz w:val="16"/>
-      </w:rPr>
-      <w:t xml:space="preserve">  Strona </w:t>
+      <w:t xml:space="preserve">AMSteel Quote - Raport wersji  |  Mateusz Mazur  |  Strona </w:t>
     </w:r>
     <w:r>
       <w:fldChar w:fldCharType="begin"/>

</xml_diff>